<commit_message>
docs: guía Word de clientes sincronizada a v1.3.0
</commit_message>
<xml_diff>
--- a/docs/GUIA-INTEGRACION-CLIENTES.docx
+++ b/docs/GUIA-INTEGRACION-CLIENTES.docx
@@ -109,7 +109,7 @@
           <w:sz w:val="22"/>
           <w:szCs w:val="22"/>
         </w:rPr>
-        <w:t xml:space="preserve">1.1.0</w:t>
+        <w:t xml:space="preserve">1.3.0</w:t>
       </w:r>
     </w:p>
     <w:p>
@@ -132,7 +132,7 @@
           <w:sz w:val="22"/>
           <w:szCs w:val="22"/>
         </w:rPr>
-        <w:t xml:space="preserve">julio de 2026</w:t>
+        <w:t xml:space="preserve">agosto de 2026</w:t>
       </w:r>
     </w:p>
     <w:p>
@@ -446,7 +446,7 @@
                 <w:sz w:val="20"/>
                 <w:szCs w:val="20"/>
               </w:rPr>
-              <w:t xml:space="preserve">El firmante ve el PDF a firmar, puede descargarlo y acepta términos y condiciones. El visor incluye zoom (50%–300%) y navegación de páginas.</w:t>
+              <w:t xml:space="preserve">El firmante ve el PDF a firmar, puede descargarlo y acepta términos y condiciones (si el documento requiere verificación de identidad, se muestra también el aviso de consentimiento KYC). El visor incluye zoom (50%–300%) y navegación de páginas.</w:t>
             </w:r>
           </w:p>
         </w:tc>
@@ -728,7 +728,23 @@
                 <w:sz w:val="20"/>
                 <w:szCs w:val="20"/>
               </w:rPr>
-              <w:t xml:space="preserve">Cámara frontal con óvalo guía: el SDK detecta el rostro centrado y nítido y captura automáticamente. La vista previa se muestra en espejo, como en cualquier app de cámara frontal.</w:t>
+              <w:t xml:space="preserve">La cámara frontal se abre de inmediato, sin pantalla de instrucción previa, con un óvalo guía: el SDK detecta el rostro centrado y nítido y captura automáticamente (o con el botón de captura manual). </w:t>
+            </w:r>
+            <w:r>
+              <w:rPr>
+                <w:b/>
+                <w:bCs/>
+                <w:sz w:val="20"/>
+                <w:szCs w:val="20"/>
+              </w:rPr>
+              <w:t xml:space="preserve">Es obligatoria por cámara</w:t>
+            </w:r>
+            <w:r>
+              <w:rPr>
+                <w:sz w:val="20"/>
+                <w:szCs w:val="20"/>
+              </w:rPr>
+              <w:t xml:space="preserve">: a diferencia de los pasos 2 y 3, no hay alternativa de subir un archivo (sección 9).</w:t>
             </w:r>
           </w:p>
         </w:tc>
@@ -916,7 +932,7 @@
                 <w:sz w:val="20"/>
                 <w:szCs w:val="20"/>
               </w:rPr>
-              <w:t xml:space="preserve">El firmante confirma las posiciones de su firma sobre el PDF real, viendo el tamaño exacto con el que quedará estampada (37×24 mm).</w:t>
+              <w:t xml:space="preserve">El firmante confirma las posiciones de su firma sobre el PDF real, viendo el tamaño exacto con el que quedará estampada (35×22 mm).</w:t>
             </w:r>
           </w:p>
         </w:tc>
@@ -1480,6 +1496,76 @@
       </w:r>
       <w:r>
         <w:t xml:space="preserve">, ~9 MB) que ese worker descarga de forma perezosa solo cuando el firmante llega al paso de identificación.</w:t>
+      </w:r>
+    </w:p>
+    <w:p>
+      <w:pPr>
+        <w:pBdr>
+          <w:left w:val="single" w:color="6AC1B4" w:sz="18"/>
+        </w:pBdr>
+        <w:shd w:fill="EAF6F3" w:val="clear"/>
+        <w:spacing w:after="200" w:before="120" w:line="276"/>
+        <w:ind w:left="240" w:right="240"/>
+      </w:pPr>
+      <w:r>
+        <w:rPr>
+          <w:b/>
+          <w:bCs/>
+          <w:color w:val="2E8C7D"/>
+        </w:rPr>
+        <w:t xml:space="preserve">Novedad: </w:t>
+      </w:r>
+      <w:r>
+        <w:rPr>
+          <w:rFonts w:ascii="Consolas" w:cs="Consolas" w:eastAsia="Consolas" w:hAnsi="Consolas"/>
+          <w:color w:val="111928"/>
+          <w:sz w:val="20"/>
+          <w:szCs w:val="20"/>
+          <w:shd w:fill="F4F6F8" w:val="clear"/>
+        </w:rPr>
+        <w:t xml:space="preserve">scan-assets/</w:t>
+      </w:r>
+      <w:r>
+        <w:t xml:space="preserve"> también incluye </w:t>
+      </w:r>
+      <w:r>
+        <w:rPr>
+          <w:rFonts w:ascii="Consolas" w:cs="Consolas" w:eastAsia="Consolas" w:hAnsi="Consolas"/>
+          <w:color w:val="111928"/>
+          <w:sz w:val="20"/>
+          <w:szCs w:val="20"/>
+          <w:shd w:fill="F4F6F8" w:val="clear"/>
+        </w:rPr>
+        <w:t xml:space="preserve">pdf.worker.min.mjs</w:t>
+      </w:r>
+      <w:r>
+        <w:t xml:space="preserve">, el worker del visor de PDF (sección 10.2), pineado a la versión de </w:t>
+      </w:r>
+      <w:r>
+        <w:rPr>
+          <w:rFonts w:ascii="Consolas" w:cs="Consolas" w:eastAsia="Consolas" w:hAnsi="Consolas"/>
+          <w:color w:val="111928"/>
+          <w:sz w:val="20"/>
+          <w:szCs w:val="20"/>
+          <w:shd w:fill="F4F6F8" w:val="clear"/>
+        </w:rPr>
+        <w:t xml:space="preserve">pdfjs-dist</w:t>
+      </w:r>
+      <w:r>
+        <w:t xml:space="preserve"> del SDK. Si ya sirves </w:t>
+      </w:r>
+      <w:r>
+        <w:rPr>
+          <w:rFonts w:ascii="Consolas" w:cs="Consolas" w:eastAsia="Consolas" w:hAnsi="Consolas"/>
+          <w:color w:val="111928"/>
+          <w:sz w:val="20"/>
+          <w:szCs w:val="20"/>
+          <w:shd w:fill="F4F6F8" w:val="clear"/>
+        </w:rPr>
+        <w:t xml:space="preserve">scan-assets/</w:t>
+      </w:r>
+      <w:r>
+        <w:t xml:space="preserve"> para la INE, el visor de PDF queda cubierto sin pasos extra.</w:t>
       </w:r>
     </w:p>
     <w:p>
@@ -2675,61 +2761,10 @@
           <w:b/>
           <w:bCs/>
         </w:rPr>
-        <w:t xml:space="preserve">Que Digid habilite tu dominio en su configuración de CORS.</w:t>
-      </w:r>
-      <w:r>
-        <w:t xml:space="preserve"> El SDK llama a la API de Digid directamente desde el navegador del firmante; solicita el alta indicando el dominio exacto, con esquema y subdominio.</w:t>
-      </w:r>
-    </w:p>
-    <w:p>
-      <w:pPr>
-        <w:pStyle w:val="Heading1"/>
-      </w:pPr>
-      <w:r>
-        <w:t xml:space="preserve">4. Instalación</w:t>
-      </w:r>
-    </w:p>
-    <w:p>
-      <w:pPr>
-        <w:spacing w:after="160" w:line="276"/>
-      </w:pPr>
-      <w:r>
-        <w:t xml:space="preserve">El paquete se distribuye en el registro público de npm; no requiere credenciales para instalarse.</w:t>
-      </w:r>
-    </w:p>
-    <w:p>
-      <w:pPr>
-        <w:pStyle w:val="Heading2"/>
-      </w:pPr>
-      <w:r>
-        <w:t xml:space="preserve">4.1 Instalar el paquete</w:t>
-      </w:r>
-    </w:p>
-    <w:p>
-      <w:pPr>
-        <w:pBdr>
-          <w:left w:val="single" w:color="6AC1B4" w:sz="12"/>
-        </w:pBdr>
-        <w:shd w:fill="F4F6F8" w:val="clear"/>
-        <w:spacing w:after="200" w:before="0" w:line="240"/>
-        <w:ind w:left="240" w:right="240"/>
-      </w:pPr>
-      <w:r>
-        <w:rPr>
-          <w:rFonts w:ascii="Consolas" w:cs="Consolas" w:eastAsia="Consolas" w:hAnsi="Consolas"/>
-          <w:color w:val="111928"/>
-          <w:sz w:val="18"/>
-          <w:szCs w:val="18"/>
-        </w:rPr>
-        <w:t xml:space="preserve">npm install @digid-sdk/firma-autografa-react</w:t>
-      </w:r>
-    </w:p>
-    <w:p>
-      <w:pPr>
-        <w:spacing w:after="160" w:line="276"/>
-      </w:pPr>
-      <w:r>
-        <w:t xml:space="preserve">Incluye sus tipos de TypeScript. </w:t>
+        <w:t xml:space="preserve">CORS: hoy no necesitas registrar tu dominio.</w:t>
+      </w:r>
+      <w:r>
+        <w:t xml:space="preserve"> Los endpoints que consume el SDK (</w:t>
       </w:r>
       <w:r>
         <w:rPr>
@@ -2739,10 +2774,26 @@
           <w:szCs w:val="20"/>
           <w:shd w:fill="F4F6F8" w:val="clear"/>
         </w:rPr>
-        <w:t xml:space="preserve">pdfjs-dist</w:t>
-      </w:r>
-      <w:r>
-        <w:t xml:space="preserve"> se instala como dependencia transitiva; React y ReactDOM deben existir ya en tu proyecto.</w:t>
+        <w:t xml:space="preserve">/api/*</w:t>
+      </w:r>
+      <w:r>
+        <w:t xml:space="preserve">) están autorizados por token, no por origen. Esto puede cambiar si Digid endurece el allowlist más adelante; mientras tanto, el proxy opcional de la sección 6.3 sigue siendo la salida si algo cambia.</w:t>
+      </w:r>
+    </w:p>
+    <w:p>
+      <w:pPr>
+        <w:pStyle w:val="Heading1"/>
+      </w:pPr>
+      <w:r>
+        <w:t xml:space="preserve">4. Instalación</w:t>
+      </w:r>
+    </w:p>
+    <w:p>
+      <w:pPr>
+        <w:spacing w:after="160" w:line="276"/>
+      </w:pPr>
+      <w:r>
+        <w:t xml:space="preserve">El paquete se distribuye en el registro público de npm; no requiere credenciales para instalarse.</w:t>
       </w:r>
     </w:p>
     <w:p>
@@ -2750,15 +2801,7 @@
         <w:pStyle w:val="Heading2"/>
       </w:pPr>
       <w:r>
-        <w:t xml:space="preserve">4.2 Importar la hoja de estilos</w:t>
-      </w:r>
-    </w:p>
-    <w:p>
-      <w:pPr>
-        <w:spacing w:after="160" w:line="276"/>
-      </w:pPr>
-      <w:r>
-        <w:t xml:space="preserve">Sin ella, el SDK se renderiza sin ningún formato. Impórtala una vez, en el punto de entrada de tu aplicación:</w:t>
+        <w:t xml:space="preserve">4.1 Instalar el paquete</w:t>
       </w:r>
     </w:p>
     <w:p>
@@ -2777,15 +2820,7 @@
           <w:sz w:val="18"/>
           <w:szCs w:val="18"/>
         </w:rPr>
-        <w:t xml:space="preserve">import '@digid-sdk/firma-autografa-react/styles.css';</w:t>
-      </w:r>
-    </w:p>
-    <w:p>
-      <w:pPr>
-        <w:pStyle w:val="Heading2"/>
-      </w:pPr>
-      <w:r>
-        <w:t xml:space="preserve">4.3 Copiar los assets del escáner</w:t>
+        <w:t xml:space="preserve">npm install @digid-sdk/firma-autografa-react</w:t>
       </w:r>
     </w:p>
     <w:p>
@@ -2793,34 +2828,7 @@
         <w:spacing w:after="160" w:line="276"/>
       </w:pPr>
       <w:r>
-        <w:t xml:space="preserve">Necesario para el recorte automático de la INE (el porqué está en la sección 1.3):</w:t>
-      </w:r>
-    </w:p>
-    <w:p>
-      <w:pPr>
-        <w:pBdr>
-          <w:left w:val="single" w:color="6AC1B4" w:sz="12"/>
-        </w:pBdr>
-        <w:shd w:fill="F4F6F8" w:val="clear"/>
-        <w:spacing w:after="200" w:before="0" w:line="240"/>
-        <w:ind w:left="240" w:right="240"/>
-      </w:pPr>
-      <w:r>
-        <w:rPr>
-          <w:rFonts w:ascii="Consolas" w:cs="Consolas" w:eastAsia="Consolas" w:hAnsi="Consolas"/>
-          <w:color w:val="111928"/>
-          <w:sz w:val="18"/>
-          <w:szCs w:val="18"/>
-        </w:rPr>
-        <w:t xml:space="preserve">cp -R node_modules/@digid-sdk/firma-autografa-react/scan-assets public/digid-scan</w:t>
-      </w:r>
-    </w:p>
-    <w:p>
-      <w:pPr>
-        <w:spacing w:after="160" w:line="276"/>
-      </w:pPr>
-      <w:r>
-        <w:t xml:space="preserve">Como </w:t>
+        <w:t xml:space="preserve">Incluye sus tipos de TypeScript. </w:t>
       </w:r>
       <w:r>
         <w:rPr>
@@ -2830,10 +2838,61 @@
           <w:szCs w:val="20"/>
           <w:shd w:fill="F4F6F8" w:val="clear"/>
         </w:rPr>
-        <w:t xml:space="preserve">node_modules</w:t>
-      </w:r>
-      <w:r>
-        <w:t xml:space="preserve"> no se versiona, engancha la copia al </w:t>
+        <w:t xml:space="preserve">pdfjs-dist</w:t>
+      </w:r>
+      <w:r>
+        <w:t xml:space="preserve"> se instala como dependencia transitiva; React y ReactDOM deben existir ya en tu proyecto.</w:t>
+      </w:r>
+    </w:p>
+    <w:p>
+      <w:pPr>
+        <w:pStyle w:val="Heading2"/>
+      </w:pPr>
+      <w:r>
+        <w:t xml:space="preserve">4.2 Importar la hoja de estilos</w:t>
+      </w:r>
+    </w:p>
+    <w:p>
+      <w:pPr>
+        <w:spacing w:after="160" w:line="276"/>
+      </w:pPr>
+      <w:r>
+        <w:t xml:space="preserve">Sin ella, el SDK se renderiza sin ningún formato. Impórtala una vez, en el punto de entrada de tu aplicación:</w:t>
+      </w:r>
+    </w:p>
+    <w:p>
+      <w:pPr>
+        <w:pBdr>
+          <w:left w:val="single" w:color="6AC1B4" w:sz="12"/>
+        </w:pBdr>
+        <w:shd w:fill="F4F6F8" w:val="clear"/>
+        <w:spacing w:after="200" w:before="0" w:line="240"/>
+        <w:ind w:left="240" w:right="240"/>
+      </w:pPr>
+      <w:r>
+        <w:rPr>
+          <w:rFonts w:ascii="Consolas" w:cs="Consolas" w:eastAsia="Consolas" w:hAnsi="Consolas"/>
+          <w:color w:val="111928"/>
+          <w:sz w:val="18"/>
+          <w:szCs w:val="18"/>
+        </w:rPr>
+        <w:t xml:space="preserve">import '@digid-sdk/firma-autografa-react/styles.css';</w:t>
+      </w:r>
+    </w:p>
+    <w:p>
+      <w:pPr>
+        <w:pStyle w:val="Heading2"/>
+      </w:pPr>
+      <w:r>
+        <w:t xml:space="preserve">4.3 Copiar los assets del escáner</w:t>
+      </w:r>
+    </w:p>
+    <w:p>
+      <w:pPr>
+        <w:spacing w:after="160" w:line="276"/>
+      </w:pPr>
+      <w:r>
+        <w:t xml:space="preserve">Necesario para el recorte automático de la INE, y desde esta versión también incluye el worker del visor de PDF (</w:t>
       </w:r>
       <w:r>
         <w:rPr>
@@ -2843,10 +2902,37 @@
           <w:szCs w:val="20"/>
           <w:shd w:fill="F4F6F8" w:val="clear"/>
         </w:rPr>
-        <w:t xml:space="preserve">postinstall</w:t>
-      </w:r>
-      <w:r>
-        <w:t xml:space="preserve"> de tu </w:t>
+        <w:t xml:space="preserve">pdf.worker.min.mjs</w:t>
+      </w:r>
+      <w:r>
+        <w:t xml:space="preserve">, sección 10.2) — el porqué de ambos está en la sección 1.3:</w:t>
+      </w:r>
+    </w:p>
+    <w:p>
+      <w:pPr>
+        <w:pBdr>
+          <w:left w:val="single" w:color="6AC1B4" w:sz="12"/>
+        </w:pBdr>
+        <w:shd w:fill="F4F6F8" w:val="clear"/>
+        <w:spacing w:after="200" w:before="0" w:line="240"/>
+        <w:ind w:left="240" w:right="240"/>
+      </w:pPr>
+      <w:r>
+        <w:rPr>
+          <w:rFonts w:ascii="Consolas" w:cs="Consolas" w:eastAsia="Consolas" w:hAnsi="Consolas"/>
+          <w:color w:val="111928"/>
+          <w:sz w:val="18"/>
+          <w:szCs w:val="18"/>
+        </w:rPr>
+        <w:t xml:space="preserve">cp -R node_modules/@digid-sdk/firma-autografa-react/scan-assets public/digid-scan</w:t>
+      </w:r>
+    </w:p>
+    <w:p>
+      <w:pPr>
+        <w:spacing w:after="160" w:line="276"/>
+      </w:pPr>
+      <w:r>
+        <w:t xml:space="preserve">Como </w:t>
       </w:r>
       <w:r>
         <w:rPr>
@@ -2856,10 +2942,10 @@
           <w:szCs w:val="20"/>
           <w:shd w:fill="F4F6F8" w:val="clear"/>
         </w:rPr>
-        <w:t xml:space="preserve">package.json</w:t>
-      </w:r>
-      <w:r>
-        <w:t xml:space="preserve"> para que se repita en cada instalación — sin esto, un despliegue limpio con </w:t>
+        <w:t xml:space="preserve">node_modules</w:t>
+      </w:r>
+      <w:r>
+        <w:t xml:space="preserve"> no se versiona, engancha la copia al </w:t>
       </w:r>
       <w:r>
         <w:rPr>
@@ -2869,6 +2955,32 @@
           <w:szCs w:val="20"/>
           <w:shd w:fill="F4F6F8" w:val="clear"/>
         </w:rPr>
+        <w:t xml:space="preserve">postinstall</w:t>
+      </w:r>
+      <w:r>
+        <w:t xml:space="preserve"> de tu </w:t>
+      </w:r>
+      <w:r>
+        <w:rPr>
+          <w:rFonts w:ascii="Consolas" w:cs="Consolas" w:eastAsia="Consolas" w:hAnsi="Consolas"/>
+          <w:color w:val="111928"/>
+          <w:sz w:val="20"/>
+          <w:szCs w:val="20"/>
+          <w:shd w:fill="F4F6F8" w:val="clear"/>
+        </w:rPr>
+        <w:t xml:space="preserve">package.json</w:t>
+      </w:r>
+      <w:r>
+        <w:t xml:space="preserve"> para que se repita en cada instalación — sin esto, un despliegue limpio con </w:t>
+      </w:r>
+      <w:r>
+        <w:rPr>
+          <w:rFonts w:ascii="Consolas" w:cs="Consolas" w:eastAsia="Consolas" w:hAnsi="Consolas"/>
+          <w:color w:val="111928"/>
+          <w:sz w:val="20"/>
+          <w:szCs w:val="20"/>
+          <w:shd w:fill="F4F6F8" w:val="clear"/>
+        </w:rPr>
         <w:t xml:space="preserve">npm ci</w:t>
       </w:r>
       <w:r>
@@ -2912,7 +3024,7 @@
         <w:t xml:space="preserve">Si omites este paso: </w:t>
       </w:r>
       <w:r>
-        <w:t xml:space="preserve">El flujo de firma sigue funcionando: los pasos de INE se degradan a captura manual, sin detección en vivo ni corrección de perspectiva. La selfie no se ve afectada. Ver la tabla de la sección 1.3.</w:t>
+        <w:t xml:space="preserve">El flujo de firma sigue funcionando: los pasos de INE se degradan a captura manual, sin detección en vivo ni corrección de perspectiva, y el visor de PDF pierde su fallback local (sección 10.2). La selfie no se ve afectada. Ver la tabla de la sección 1.3.</w:t>
       </w:r>
     </w:p>
     <w:p>
@@ -3524,10 +3636,23 @@
     </w:p>
     <w:p>
       <w:pPr>
-        <w:spacing w:after="160" w:line="276"/>
-      </w:pPr>
-      <w:r>
-        <w:t xml:space="preserve">Recomendación: integra con el default </w:t>
+        <w:pBdr>
+          <w:left w:val="single" w:color="6AC1B4" w:sz="18"/>
+        </w:pBdr>
+        <w:shd w:fill="EAF6F3" w:val="clear"/>
+        <w:spacing w:after="200" w:before="120" w:line="276"/>
+        <w:ind w:left="240" w:right="240"/>
+      </w:pPr>
+      <w:r>
+        <w:rPr>
+          <w:b/>
+          <w:bCs/>
+          <w:color w:val="2E8C7D"/>
+        </w:rPr>
+        <w:t xml:space="preserve">Orden de despliegue: </w:t>
+      </w:r>
+      <w:r>
+        <w:t xml:space="preserve">Mandar un header propio agrega preflight a cada llamada cross-origin. Si tu </w:t>
       </w:r>
       <w:r>
         <w:rPr>
@@ -3537,10 +3662,20 @@
           <w:szCs w:val="20"/>
           <w:shd w:fill="F4F6F8" w:val="clear"/>
         </w:rPr>
-        <w:t xml:space="preserve">'both'</w:t>
-      </w:r>
-      <w:r>
-        <w:t xml:space="preserve">, verifica el flujo completo y cambia después a </w:t>
+        <w:t xml:space="preserve">baseUrl</w:t>
+      </w:r>
+      <w:r>
+        <w:t xml:space="preserve"> apunta a otro origen, el backend debe aceptar el header y permitirlo en CORS </w:t>
+      </w:r>
+      <w:r>
+        <w:rPr>
+          <w:b/>
+          <w:bCs/>
+        </w:rPr>
+        <w:t xml:space="preserve">antes</w:t>
+      </w:r>
+      <w:r>
+        <w:t xml:space="preserve"> de usar </w:t>
       </w:r>
       <w:r>
         <w:rPr>
@@ -3550,10 +3685,62 @@
           <w:szCs w:val="20"/>
           <w:shd w:fill="F4F6F8" w:val="clear"/>
         </w:rPr>
+        <w:t xml:space="preserve">'both'</w:t>
+      </w:r>
+      <w:r>
+        <w:t xml:space="preserve"> o </w:t>
+      </w:r>
+      <w:r>
+        <w:rPr>
+          <w:rFonts w:ascii="Consolas" w:cs="Consolas" w:eastAsia="Consolas" w:hAnsi="Consolas"/>
+          <w:color w:val="111928"/>
+          <w:sz w:val="20"/>
+          <w:szCs w:val="20"/>
+          <w:shd w:fill="F4F6F8" w:val="clear"/>
+        </w:rPr>
         <w:t xml:space="preserve">'header'</w:t>
       </w:r>
       <w:r>
-        <w:t xml:space="preserve">. Si tienes dudas sobre qué ambiente ya lo soporta, consulta a soporte de Digid.</w:t>
+        <w:t xml:space="preserve"> — si no, fallarán todas las llamadas. Con </w:t>
+      </w:r>
+      <w:r>
+        <w:rPr>
+          <w:rFonts w:ascii="Consolas" w:cs="Consolas" w:eastAsia="Consolas" w:hAnsi="Consolas"/>
+          <w:color w:val="111928"/>
+          <w:sz w:val="20"/>
+          <w:szCs w:val="20"/>
+          <w:shd w:fill="F4F6F8" w:val="clear"/>
+        </w:rPr>
+        <w:t xml:space="preserve">baseUrl: ''</w:t>
+      </w:r>
+      <w:r>
+        <w:t xml:space="preserve"> (mismo origen) no aplica. Recomendado: integra con el default </w:t>
+      </w:r>
+      <w:r>
+        <w:rPr>
+          <w:rFonts w:ascii="Consolas" w:cs="Consolas" w:eastAsia="Consolas" w:hAnsi="Consolas"/>
+          <w:color w:val="111928"/>
+          <w:sz w:val="20"/>
+          <w:szCs w:val="20"/>
+          <w:shd w:fill="F4F6F8" w:val="clear"/>
+        </w:rPr>
+        <w:t xml:space="preserve">'both'</w:t>
+      </w:r>
+      <w:r>
+        <w:t xml:space="preserve">, verifica el flujo completo y cambia después a </w:t>
+      </w:r>
+      <w:r>
+        <w:rPr>
+          <w:rFonts w:ascii="Consolas" w:cs="Consolas" w:eastAsia="Consolas" w:hAnsi="Consolas"/>
+          <w:color w:val="111928"/>
+          <w:sz w:val="20"/>
+          <w:szCs w:val="20"/>
+          <w:shd w:fill="F4F6F8" w:val="clear"/>
+        </w:rPr>
+        <w:t xml:space="preserve">'header'</w:t>
+      </w:r>
+      <w:r>
+        <w:t xml:space="preserve">.</w:t>
       </w:r>
     </w:p>
     <w:p>
@@ -4536,6 +4723,389 @@
           <w:szCs w:val="18"/>
         </w:rPr>
         <w:t xml:space="preserve">}</w:t>
+      </w:r>
+    </w:p>
+    <w:p>
+      <w:pPr>
+        <w:pStyle w:val="Heading2"/>
+      </w:pPr>
+      <w:r>
+        <w:t xml:space="preserve">6.3 Proxy local (opcional)</w:t>
+      </w:r>
+    </w:p>
+    <w:p>
+      <w:pPr>
+        <w:spacing w:after="160" w:line="276"/>
+      </w:pPr>
+      <w:r>
+        <w:t xml:space="preserve">El PDF y la imagen de firma se sirven vía </w:t>
+      </w:r>
+      <w:r>
+        <w:rPr>
+          <w:rFonts w:ascii="Consolas" w:cs="Consolas" w:eastAsia="Consolas" w:hAnsi="Consolas"/>
+          <w:color w:val="111928"/>
+          <w:sz w:val="20"/>
+          <w:szCs w:val="20"/>
+          <w:shd w:fill="F4F6F8" w:val="clear"/>
+        </w:rPr>
+        <w:t xml:space="preserve">/api/archivofirma/document_pdf</w:t>
+      </w:r>
+      <w:r>
+        <w:t xml:space="preserve"> y </w:t>
+      </w:r>
+      <w:r>
+        <w:rPr>
+          <w:rFonts w:ascii="Consolas" w:cs="Consolas" w:eastAsia="Consolas" w:hAnsi="Consolas"/>
+          <w:color w:val="111928"/>
+          <w:sz w:val="20"/>
+          <w:szCs w:val="20"/>
+          <w:shd w:fill="F4F6F8" w:val="clear"/>
+        </w:rPr>
+        <w:t xml:space="preserve">/api/archivofirma/signature_image</w:t>
+      </w:r>
+      <w:r>
+        <w:t xml:space="preserve">, autorizados por token y cubiertos por la misma política CORS que el resto de </w:t>
+      </w:r>
+      <w:r>
+        <w:rPr>
+          <w:rFonts w:ascii="Consolas" w:cs="Consolas" w:eastAsia="Consolas" w:hAnsi="Consolas"/>
+          <w:color w:val="111928"/>
+          <w:sz w:val="20"/>
+          <w:szCs w:val="20"/>
+          <w:shd w:fill="F4F6F8" w:val="clear"/>
+        </w:rPr>
+        <w:t xml:space="preserve">/api</w:t>
+      </w:r>
+      <w:r>
+        <w:t xml:space="preserve">. Llamar a Digid directo con </w:t>
+      </w:r>
+      <w:r>
+        <w:rPr>
+          <w:rFonts w:ascii="Consolas" w:cs="Consolas" w:eastAsia="Consolas" w:hAnsi="Consolas"/>
+          <w:color w:val="111928"/>
+          <w:sz w:val="20"/>
+          <w:szCs w:val="20"/>
+          <w:shd w:fill="F4F6F8" w:val="clear"/>
+        </w:rPr>
+        <w:t xml:space="preserve">baseUrl</w:t>
+      </w:r>
+      <w:r>
+        <w:t xml:space="preserve"> funciona out of the box; el proxy de esta sección </w:t>
+      </w:r>
+      <w:r>
+        <w:rPr>
+          <w:b/>
+          <w:bCs/>
+        </w:rPr>
+        <w:t xml:space="preserve">no es necesario</w:t>
+      </w:r>
+      <w:r>
+        <w:t xml:space="preserve">, pero sigue siendo válido si prefieres que tu app y Digid compartan el mismo origen (evita CORS por completo, útil con CSP muy estricta).</w:t>
+      </w:r>
+    </w:p>
+    <w:p>
+      <w:pPr>
+        <w:spacing w:after="160" w:line="276"/>
+      </w:pPr>
+      <w:r>
+        <w:rPr>
+          <w:b/>
+          <w:bCs/>
+        </w:rPr>
+        <w:t xml:space="preserve">Vite</w:t>
+      </w:r>
+      <w:r>
+        <w:t xml:space="preserve"> (</w:t>
+      </w:r>
+      <w:r>
+        <w:rPr>
+          <w:rFonts w:ascii="Consolas" w:cs="Consolas" w:eastAsia="Consolas" w:hAnsi="Consolas"/>
+          <w:color w:val="111928"/>
+          <w:sz w:val="20"/>
+          <w:szCs w:val="20"/>
+          <w:shd w:fill="F4F6F8" w:val="clear"/>
+        </w:rPr>
+        <w:t xml:space="preserve">vite.config.ts</w:t>
+      </w:r>
+      <w:r>
+        <w:t xml:space="preserve">):</w:t>
+      </w:r>
+    </w:p>
+    <w:p>
+      <w:pPr>
+        <w:pBdr>
+          <w:left w:val="single" w:color="6AC1B4" w:sz="12"/>
+        </w:pBdr>
+        <w:shd w:fill="F4F6F8" w:val="clear"/>
+        <w:spacing w:after="0" w:before="0" w:line="240"/>
+        <w:ind w:left="240" w:right="240"/>
+      </w:pPr>
+      <w:r>
+        <w:rPr>
+          <w:rFonts w:ascii="Consolas" w:cs="Consolas" w:eastAsia="Consolas" w:hAnsi="Consolas"/>
+          <w:color w:val="111928"/>
+          <w:sz w:val="18"/>
+          <w:szCs w:val="18"/>
+        </w:rPr>
+        <w:t xml:space="preserve">export default defineConfig({</w:t>
+      </w:r>
+    </w:p>
+    <w:p>
+      <w:pPr>
+        <w:pBdr>
+          <w:left w:val="single" w:color="6AC1B4" w:sz="12"/>
+        </w:pBdr>
+        <w:shd w:fill="F4F6F8" w:val="clear"/>
+        <w:spacing w:after="0" w:before="0" w:line="240"/>
+        <w:ind w:left="240" w:right="240"/>
+      </w:pPr>
+      <w:r>
+        <w:rPr>
+          <w:rFonts w:ascii="Consolas" w:cs="Consolas" w:eastAsia="Consolas" w:hAnsi="Consolas"/>
+          <w:color w:val="111928"/>
+          <w:sz w:val="18"/>
+          <w:szCs w:val="18"/>
+        </w:rPr>
+        <w:t xml:space="preserve">  server: {</w:t>
+      </w:r>
+    </w:p>
+    <w:p>
+      <w:pPr>
+        <w:pBdr>
+          <w:left w:val="single" w:color="6AC1B4" w:sz="12"/>
+        </w:pBdr>
+        <w:shd w:fill="F4F6F8" w:val="clear"/>
+        <w:spacing w:after="0" w:before="0" w:line="240"/>
+        <w:ind w:left="240" w:right="240"/>
+      </w:pPr>
+      <w:r>
+        <w:rPr>
+          <w:rFonts w:ascii="Consolas" w:cs="Consolas" w:eastAsia="Consolas" w:hAnsi="Consolas"/>
+          <w:color w:val="111928"/>
+          <w:sz w:val="18"/>
+          <w:szCs w:val="18"/>
+        </w:rPr>
+        <w:t xml:space="preserve">    proxy: {</w:t>
+      </w:r>
+    </w:p>
+    <w:p>
+      <w:pPr>
+        <w:pBdr>
+          <w:left w:val="single" w:color="6AC1B4" w:sz="12"/>
+        </w:pBdr>
+        <w:shd w:fill="F4F6F8" w:val="clear"/>
+        <w:spacing w:after="0" w:before="0" w:line="240"/>
+        <w:ind w:left="240" w:right="240"/>
+      </w:pPr>
+      <w:r>
+        <w:rPr>
+          <w:rFonts w:ascii="Consolas" w:cs="Consolas" w:eastAsia="Consolas" w:hAnsi="Consolas"/>
+          <w:color w:val="111928"/>
+          <w:sz w:val="18"/>
+          <w:szCs w:val="18"/>
+        </w:rPr>
+        <w:t xml:space="preserve">      '/api': { target: 'https://pruebas.digidmexico.com.mx', changeOrigin: true },</w:t>
+      </w:r>
+    </w:p>
+    <w:p>
+      <w:pPr>
+        <w:pBdr>
+          <w:left w:val="single" w:color="6AC1B4" w:sz="12"/>
+        </w:pBdr>
+        <w:shd w:fill="F4F6F8" w:val="clear"/>
+        <w:spacing w:after="0" w:before="0" w:line="240"/>
+        <w:ind w:left="240" w:right="240"/>
+      </w:pPr>
+      <w:r>
+        <w:rPr>
+          <w:rFonts w:ascii="Consolas" w:cs="Consolas" w:eastAsia="Consolas" w:hAnsi="Consolas"/>
+          <w:color w:val="111928"/>
+          <w:sz w:val="18"/>
+          <w:szCs w:val="18"/>
+        </w:rPr>
+        <w:t xml:space="preserve">    },</w:t>
+      </w:r>
+    </w:p>
+    <w:p>
+      <w:pPr>
+        <w:pBdr>
+          <w:left w:val="single" w:color="6AC1B4" w:sz="12"/>
+        </w:pBdr>
+        <w:shd w:fill="F4F6F8" w:val="clear"/>
+        <w:spacing w:after="0" w:before="0" w:line="240"/>
+        <w:ind w:left="240" w:right="240"/>
+      </w:pPr>
+      <w:r>
+        <w:rPr>
+          <w:rFonts w:ascii="Consolas" w:cs="Consolas" w:eastAsia="Consolas" w:hAnsi="Consolas"/>
+          <w:color w:val="111928"/>
+          <w:sz w:val="18"/>
+          <w:szCs w:val="18"/>
+        </w:rPr>
+        <w:t xml:space="preserve">  },</w:t>
+      </w:r>
+    </w:p>
+    <w:p>
+      <w:pPr>
+        <w:pBdr>
+          <w:left w:val="single" w:color="6AC1B4" w:sz="12"/>
+        </w:pBdr>
+        <w:shd w:fill="F4F6F8" w:val="clear"/>
+        <w:spacing w:after="200" w:before="0" w:line="240"/>
+        <w:ind w:left="240" w:right="240"/>
+      </w:pPr>
+      <w:r>
+        <w:rPr>
+          <w:rFonts w:ascii="Consolas" w:cs="Consolas" w:eastAsia="Consolas" w:hAnsi="Consolas"/>
+          <w:color w:val="111928"/>
+          <w:sz w:val="18"/>
+          <w:szCs w:val="18"/>
+        </w:rPr>
+        <w:t xml:space="preserve">});</w:t>
+      </w:r>
+    </w:p>
+    <w:p>
+      <w:pPr>
+        <w:spacing w:after="160" w:line="276"/>
+      </w:pPr>
+      <w:r>
+        <w:rPr>
+          <w:b/>
+          <w:bCs/>
+        </w:rPr>
+        <w:t xml:space="preserve">Next.js</w:t>
+      </w:r>
+      <w:r>
+        <w:t xml:space="preserve"> (</w:t>
+      </w:r>
+      <w:r>
+        <w:rPr>
+          <w:rFonts w:ascii="Consolas" w:cs="Consolas" w:eastAsia="Consolas" w:hAnsi="Consolas"/>
+          <w:color w:val="111928"/>
+          <w:sz w:val="20"/>
+          <w:szCs w:val="20"/>
+          <w:shd w:fill="F4F6F8" w:val="clear"/>
+        </w:rPr>
+        <w:t xml:space="preserve">next.config.js</w:t>
+      </w:r>
+      <w:r>
+        <w:t xml:space="preserve">):</w:t>
+      </w:r>
+    </w:p>
+    <w:p>
+      <w:pPr>
+        <w:pBdr>
+          <w:left w:val="single" w:color="6AC1B4" w:sz="12"/>
+        </w:pBdr>
+        <w:shd w:fill="F4F6F8" w:val="clear"/>
+        <w:spacing w:after="0" w:before="0" w:line="240"/>
+        <w:ind w:left="240" w:right="240"/>
+      </w:pPr>
+      <w:r>
+        <w:rPr>
+          <w:rFonts w:ascii="Consolas" w:cs="Consolas" w:eastAsia="Consolas" w:hAnsi="Consolas"/>
+          <w:color w:val="111928"/>
+          <w:sz w:val="18"/>
+          <w:szCs w:val="18"/>
+        </w:rPr>
+        <w:t xml:space="preserve">module.exports = {</w:t>
+      </w:r>
+    </w:p>
+    <w:p>
+      <w:pPr>
+        <w:pBdr>
+          <w:left w:val="single" w:color="6AC1B4" w:sz="12"/>
+        </w:pBdr>
+        <w:shd w:fill="F4F6F8" w:val="clear"/>
+        <w:spacing w:after="0" w:before="0" w:line="240"/>
+        <w:ind w:left="240" w:right="240"/>
+      </w:pPr>
+      <w:r>
+        <w:rPr>
+          <w:rFonts w:ascii="Consolas" w:cs="Consolas" w:eastAsia="Consolas" w:hAnsi="Consolas"/>
+          <w:color w:val="111928"/>
+          <w:sz w:val="18"/>
+          <w:szCs w:val="18"/>
+        </w:rPr>
+        <w:t xml:space="preserve">  async rewrites() {</w:t>
+      </w:r>
+    </w:p>
+    <w:p>
+      <w:pPr>
+        <w:pBdr>
+          <w:left w:val="single" w:color="6AC1B4" w:sz="12"/>
+        </w:pBdr>
+        <w:shd w:fill="F4F6F8" w:val="clear"/>
+        <w:spacing w:after="0" w:before="0" w:line="240"/>
+        <w:ind w:left="240" w:right="240"/>
+      </w:pPr>
+      <w:r>
+        <w:rPr>
+          <w:rFonts w:ascii="Consolas" w:cs="Consolas" w:eastAsia="Consolas" w:hAnsi="Consolas"/>
+          <w:color w:val="111928"/>
+          <w:sz w:val="18"/>
+          <w:szCs w:val="18"/>
+        </w:rPr>
+        <w:t xml:space="preserve">    return [{ source: '/api/:path*', destination: 'https://pruebas.digidmexico.com.mx/api/:path*' }];</w:t>
+      </w:r>
+    </w:p>
+    <w:p>
+      <w:pPr>
+        <w:pBdr>
+          <w:left w:val="single" w:color="6AC1B4" w:sz="12"/>
+        </w:pBdr>
+        <w:shd w:fill="F4F6F8" w:val="clear"/>
+        <w:spacing w:after="0" w:before="0" w:line="240"/>
+        <w:ind w:left="240" w:right="240"/>
+      </w:pPr>
+      <w:r>
+        <w:rPr>
+          <w:rFonts w:ascii="Consolas" w:cs="Consolas" w:eastAsia="Consolas" w:hAnsi="Consolas"/>
+          <w:color w:val="111928"/>
+          <w:sz w:val="18"/>
+          <w:szCs w:val="18"/>
+        </w:rPr>
+        <w:t xml:space="preserve">  },</w:t>
+      </w:r>
+    </w:p>
+    <w:p>
+      <w:pPr>
+        <w:pBdr>
+          <w:left w:val="single" w:color="6AC1B4" w:sz="12"/>
+        </w:pBdr>
+        <w:shd w:fill="F4F6F8" w:val="clear"/>
+        <w:spacing w:after="200" w:before="0" w:line="240"/>
+        <w:ind w:left="240" w:right="240"/>
+      </w:pPr>
+      <w:r>
+        <w:rPr>
+          <w:rFonts w:ascii="Consolas" w:cs="Consolas" w:eastAsia="Consolas" w:hAnsi="Consolas"/>
+          <w:color w:val="111928"/>
+          <w:sz w:val="18"/>
+          <w:szCs w:val="18"/>
+        </w:rPr>
+        <w:t xml:space="preserve">};</w:t>
+      </w:r>
+    </w:p>
+    <w:p>
+      <w:pPr>
+        <w:spacing w:after="160" w:line="276"/>
+      </w:pPr>
+      <w:r>
+        <w:t xml:space="preserve">En ambos casos monta el SDK con </w:t>
+      </w:r>
+      <w:r>
+        <w:rPr>
+          <w:rFonts w:ascii="Consolas" w:cs="Consolas" w:eastAsia="Consolas" w:hAnsi="Consolas"/>
+          <w:color w:val="111928"/>
+          <w:sz w:val="20"/>
+          <w:szCs w:val="20"/>
+          <w:shd w:fill="F4F6F8" w:val="clear"/>
+        </w:rPr>
+        <w:t xml:space="preserve">baseUrl=""</w:t>
+      </w:r>
+      <w:r>
+        <w:t xml:space="preserve">.</w:t>
       </w:r>
     </w:p>
     <w:p>
@@ -5392,7 +5962,7 @@
                 <w:szCs w:val="18"/>
                 <w:shd w:fill="F4F6F8" w:val="clear"/>
               </w:rPr>
-              <w:t xml:space="preserve">detectionAssets</w:t>
+              <w:t xml:space="preserve">pdfWorkerUrl</w:t>
             </w:r>
           </w:p>
         </w:tc>
@@ -5425,6 +5995,161 @@
                 <w:szCs w:val="18"/>
                 <w:shd w:fill="F4F6F8" w:val="clear"/>
               </w:rPr>
+              <w:t xml:space="preserve">string</w:t>
+            </w:r>
+          </w:p>
+        </w:tc>
+        <w:tc>
+          <w:tcPr>
+            <w:tcW w:type="dxa" w:w="1500"/>
+            <w:tcBorders>
+              <w:top w:val="single" w:color="D9DEE4" w:sz="4"/>
+              <w:left w:val="single" w:color="D9DEE4" w:sz="4"/>
+              <w:bottom w:val="single" w:color="D9DEE4" w:sz="4"/>
+              <w:right w:val="single" w:color="D9DEE4" w:sz="4"/>
+            </w:tcBorders>
+            <w:tcMar>
+              <w:top w:type="dxa" w:w="80"/>
+              <w:left w:type="dxa" w:w="120"/>
+              <w:bottom w:type="dxa" w:w="80"/>
+              <w:right w:type="dxa" w:w="120"/>
+            </w:tcMar>
+            <w:vAlign w:val="center"/>
+          </w:tcPr>
+          <w:p>
+            <w:pPr>
+              <w:spacing w:after="0" w:line="260"/>
+            </w:pPr>
+            <w:r>
+              <w:rPr>
+                <w:sz w:val="20"/>
+                <w:szCs w:val="20"/>
+              </w:rPr>
+              <w:t xml:space="preserve">resolución automática, con reintento a </w:t>
+            </w:r>
+            <w:r>
+              <w:rPr>
+                <w:rFonts w:ascii="Consolas" w:cs="Consolas" w:eastAsia="Consolas" w:hAnsi="Consolas"/>
+                <w:color w:val="111928"/>
+                <w:sz w:val="18"/>
+                <w:szCs w:val="18"/>
+                <w:shd w:fill="F4F6F8" w:val="clear"/>
+              </w:rPr>
+              <w:t xml:space="preserve">/digid-scan/pdf.worker.min.mjs</w:t>
+            </w:r>
+          </w:p>
+        </w:tc>
+        <w:tc>
+          <w:tcPr>
+            <w:tcW w:type="dxa" w:w="3860"/>
+            <w:tcBorders>
+              <w:top w:val="single" w:color="D9DEE4" w:sz="4"/>
+              <w:left w:val="single" w:color="D9DEE4" w:sz="4"/>
+              <w:bottom w:val="single" w:color="D9DEE4" w:sz="4"/>
+              <w:right w:val="single" w:color="D9DEE4" w:sz="4"/>
+            </w:tcBorders>
+            <w:tcMar>
+              <w:top w:type="dxa" w:w="80"/>
+              <w:left w:type="dxa" w:w="120"/>
+              <w:bottom w:type="dxa" w:w="80"/>
+              <w:right w:type="dxa" w:w="120"/>
+            </w:tcMar>
+            <w:vAlign w:val="center"/>
+          </w:tcPr>
+          <w:p>
+            <w:pPr>
+              <w:spacing w:after="0" w:line="260"/>
+            </w:pPr>
+            <w:r>
+              <w:rPr>
+                <w:sz w:val="20"/>
+                <w:szCs w:val="20"/>
+              </w:rPr>
+              <w:t xml:space="preserve">URL del worker de </w:t>
+            </w:r>
+            <w:r>
+              <w:rPr>
+                <w:rFonts w:ascii="Consolas" w:cs="Consolas" w:eastAsia="Consolas" w:hAnsi="Consolas"/>
+                <w:color w:val="111928"/>
+                <w:sz w:val="18"/>
+                <w:szCs w:val="18"/>
+                <w:shd w:fill="F4F6F8" w:val="clear"/>
+              </w:rPr>
+              <w:t xml:space="preserve">pdfjs-dist</w:t>
+            </w:r>
+            <w:r>
+              <w:rPr>
+                <w:sz w:val="20"/>
+                <w:szCs w:val="20"/>
+              </w:rPr>
+              <w:t xml:space="preserve"> para el visor de PDF (sección 10.2).</w:t>
+            </w:r>
+          </w:p>
+        </w:tc>
+      </w:tr>
+      <w:tr>
+        <w:tc>
+          <w:tcPr>
+            <w:tcW w:type="dxa" w:w="1900"/>
+            <w:tcBorders>
+              <w:top w:val="single" w:color="D9DEE4" w:sz="4"/>
+              <w:left w:val="single" w:color="D9DEE4" w:sz="4"/>
+              <w:bottom w:val="single" w:color="D9DEE4" w:sz="4"/>
+              <w:right w:val="single" w:color="D9DEE4" w:sz="4"/>
+            </w:tcBorders>
+            <w:tcMar>
+              <w:top w:type="dxa" w:w="80"/>
+              <w:left w:type="dxa" w:w="120"/>
+              <w:bottom w:type="dxa" w:w="80"/>
+              <w:right w:type="dxa" w:w="120"/>
+            </w:tcMar>
+            <w:vAlign w:val="center"/>
+          </w:tcPr>
+          <w:p>
+            <w:pPr>
+              <w:spacing w:after="0" w:line="260"/>
+            </w:pPr>
+            <w:r>
+              <w:rPr>
+                <w:rFonts w:ascii="Consolas" w:cs="Consolas" w:eastAsia="Consolas" w:hAnsi="Consolas"/>
+                <w:color w:val="111928"/>
+                <w:sz w:val="18"/>
+                <w:szCs w:val="18"/>
+                <w:shd w:fill="F4F6F8" w:val="clear"/>
+              </w:rPr>
+              <w:t xml:space="preserve">detectionAssets</w:t>
+            </w:r>
+          </w:p>
+        </w:tc>
+        <w:tc>
+          <w:tcPr>
+            <w:tcW w:type="dxa" w:w="2100"/>
+            <w:tcBorders>
+              <w:top w:val="single" w:color="D9DEE4" w:sz="4"/>
+              <w:left w:val="single" w:color="D9DEE4" w:sz="4"/>
+              <w:bottom w:val="single" w:color="D9DEE4" w:sz="4"/>
+              <w:right w:val="single" w:color="D9DEE4" w:sz="4"/>
+            </w:tcBorders>
+            <w:tcMar>
+              <w:top w:type="dxa" w:w="80"/>
+              <w:left w:type="dxa" w:w="120"/>
+              <w:bottom w:type="dxa" w:w="80"/>
+              <w:right w:type="dxa" w:w="120"/>
+            </w:tcMar>
+            <w:vAlign w:val="center"/>
+          </w:tcPr>
+          <w:p>
+            <w:pPr>
+              <w:spacing w:after="0" w:line="260"/>
+            </w:pPr>
+            <w:r>
+              <w:rPr>
+                <w:rFonts w:ascii="Consolas" w:cs="Consolas" w:eastAsia="Consolas" w:hAnsi="Consolas"/>
+                <w:color w:val="111928"/>
+                <w:sz w:val="18"/>
+                <w:szCs w:val="18"/>
+                <w:shd w:fill="F4F6F8" w:val="clear"/>
+              </w:rPr>
               <w:t xml:space="preserve">DetectionAssets</w:t>
             </w:r>
           </w:p>
@@ -5485,7 +6210,24 @@
                 <w:sz w:val="20"/>
                 <w:szCs w:val="20"/>
               </w:rPr>
-              <w:t xml:space="preserve">URLs propias para autoalojar el modelo de detección de rostro de la selfie (sección 1.2).</w:t>
+              <w:t xml:space="preserve">URLs propias para autoalojar el modelo de detección de rostro de la selfie (sección 1.2). </w:t>
+            </w:r>
+            <w:r>
+              <w:rPr>
+                <w:rFonts w:ascii="Consolas" w:cs="Consolas" w:eastAsia="Consolas" w:hAnsi="Consolas"/>
+                <w:color w:val="111928"/>
+                <w:sz w:val="18"/>
+                <w:szCs w:val="18"/>
+                <w:shd w:fill="F4F6F8" w:val="clear"/>
+              </w:rPr>
+              <w:t xml:space="preserve">zxingWasmUrl</w:t>
+            </w:r>
+            <w:r>
+              <w:rPr>
+                <w:sz w:val="20"/>
+                <w:szCs w:val="20"/>
+              </w:rPr>
+              <w:t xml:space="preserve"> ya no se usa (reservado por compatibilidad).</w:t>
             </w:r>
           </w:p>
         </w:tc>
@@ -7175,19 +7917,6 @@
           <w:szCs w:val="20"/>
           <w:shd w:fill="F4F6F8" w:val="clear"/>
         </w:rPr>
-        <w:t xml:space="preserve">SelfieStep</w:t>
-      </w:r>
-      <w:r>
-        <w:t xml:space="preserve">, </w:t>
-      </w:r>
-      <w:r>
-        <w:rPr>
-          <w:rFonts w:ascii="Consolas" w:cs="Consolas" w:eastAsia="Consolas" w:hAnsi="Consolas"/>
-          <w:color w:val="111928"/>
-          <w:sz w:val="20"/>
-          <w:szCs w:val="20"/>
-          <w:shd w:fill="F4F6F8" w:val="clear"/>
-        </w:rPr>
         <w:t xml:space="preserve">CreateSignStep</w:t>
       </w:r>
       <w:r>
@@ -7326,30 +8055,7 @@
         <w:t xml:space="preserve">&lt;FirmaAutografa&gt;</w:t>
       </w:r>
       <w:r>
-        <w:t xml:space="preserve">. Existe además el subpath </w:t>
-      </w:r>
-      <w:r>
-        <w:rPr>
-          <w:rFonts w:ascii="Consolas" w:cs="Consolas" w:eastAsia="Consolas" w:hAnsi="Consolas"/>
-          <w:color w:val="111928"/>
-          <w:sz w:val="20"/>
-          <w:szCs w:val="20"/>
-          <w:shd w:fill="F4F6F8" w:val="clear"/>
-        </w:rPr>
-        <w:t xml:space="preserve">@digid-sdk/firma-autografa-react/engine</w:t>
-      </w:r>
-      <w:r>
-        <w:t xml:space="preserve"> con el motor de escaneo y detección; es </w:t>
-      </w:r>
-      <w:r>
-        <w:rPr>
-          <w:b/>
-          <w:bCs/>
-        </w:rPr>
-        <w:t xml:space="preserve">API inestable</w:t>
-      </w:r>
-      <w:r>
-        <w:t xml:space="preserve"> para casos a la medida — si lo usas, fija la versión exacta del SDK y revisa el CHANGELOG antes de actualizar.</w:t>
+        <w:t xml:space="preserve">; el resto de la superficie existe para casos a la medida y puede evolucionar entre versiones menores.</w:t>
       </w:r>
     </w:p>
     <w:p>
@@ -7935,9 +8641,9 @@
         </w:tblBorders>
       </w:tblPr>
       <w:tblGrid>
-        <w:gridCol w:w="1800"/>
-        <w:gridCol w:w="4000"/>
-        <w:gridCol w:w="3560"/>
+        <w:gridCol w:w="2400"/>
+        <w:gridCol w:w="3300"/>
+        <w:gridCol w:w="3660"/>
       </w:tblGrid>
       <w:tr>
         <w:trPr>
@@ -7945,7 +8651,7 @@
         </w:trPr>
         <w:tc>
           <w:tcPr>
-            <w:tcW w:type="dxa" w:w="1800"/>
+            <w:tcW w:type="dxa" w:w="2400"/>
             <w:tcBorders>
               <w:top w:val="single" w:color="D9DEE4" w:sz="4"/>
               <w:left w:val="single" w:color="D9DEE4" w:sz="4"/>
@@ -7978,7 +8684,7 @@
         </w:tc>
         <w:tc>
           <w:tcPr>
-            <w:tcW w:type="dxa" w:w="4000"/>
+            <w:tcW w:type="dxa" w:w="3300"/>
             <w:tcBorders>
               <w:top w:val="single" w:color="D9DEE4" w:sz="4"/>
               <w:left w:val="single" w:color="D9DEE4" w:sz="4"/>
@@ -8011,7 +8717,7 @@
         </w:tc>
         <w:tc>
           <w:tcPr>
-            <w:tcW w:type="dxa" w:w="3560"/>
+            <w:tcW w:type="dxa" w:w="3660"/>
             <w:tcBorders>
               <w:top w:val="single" w:color="D9DEE4" w:sz="4"/>
               <w:left w:val="single" w:color="D9DEE4" w:sz="4"/>
@@ -8046,7 +8752,7 @@
       <w:tr>
         <w:tc>
           <w:tcPr>
-            <w:tcW w:type="dxa" w:w="1800"/>
+            <w:tcW w:type="dxa" w:w="2400"/>
             <w:tcBorders>
               <w:top w:val="single" w:color="D9DEE4" w:sz="4"/>
               <w:left w:val="single" w:color="D9DEE4" w:sz="4"/>
@@ -8072,43 +8778,43 @@
                 <w:sz w:val="20"/>
                 <w:szCs w:val="20"/>
               </w:rPr>
-              <w:t xml:space="preserve">Cámara</w:t>
-            </w:r>
-          </w:p>
-        </w:tc>
-        <w:tc>
-          <w:tcPr>
-            <w:tcW w:type="dxa" w:w="4000"/>
-            <w:tcBorders>
-              <w:top w:val="single" w:color="D9DEE4" w:sz="4"/>
-              <w:left w:val="single" w:color="D9DEE4" w:sz="4"/>
-              <w:bottom w:val="single" w:color="D9DEE4" w:sz="4"/>
-              <w:right w:val="single" w:color="D9DEE4" w:sz="4"/>
-            </w:tcBorders>
-            <w:tcMar>
-              <w:top w:type="dxa" w:w="80"/>
-              <w:left w:type="dxa" w:w="120"/>
-              <w:bottom w:type="dxa" w:w="80"/>
-              <w:right w:type="dxa" w:w="120"/>
-            </w:tcMar>
-            <w:vAlign w:val="center"/>
-          </w:tcPr>
-          <w:p>
-            <w:pPr>
-              <w:spacing w:after="0" w:line="260"/>
-            </w:pPr>
-            <w:r>
-              <w:rPr>
-                <w:sz w:val="20"/>
-                <w:szCs w:val="20"/>
-              </w:rPr>
-              <w:t xml:space="preserve">En los pasos de captura de identificación y selfie.</w:t>
-            </w:r>
-          </w:p>
-        </w:tc>
-        <w:tc>
-          <w:tcPr>
-            <w:tcW w:type="dxa" w:w="3560"/>
+              <w:t xml:space="preserve">Cámara (INE frente/reverso)</w:t>
+            </w:r>
+          </w:p>
+        </w:tc>
+        <w:tc>
+          <w:tcPr>
+            <w:tcW w:type="dxa" w:w="3300"/>
+            <w:tcBorders>
+              <w:top w:val="single" w:color="D9DEE4" w:sz="4"/>
+              <w:left w:val="single" w:color="D9DEE4" w:sz="4"/>
+              <w:bottom w:val="single" w:color="D9DEE4" w:sz="4"/>
+              <w:right w:val="single" w:color="D9DEE4" w:sz="4"/>
+            </w:tcBorders>
+            <w:tcMar>
+              <w:top w:type="dxa" w:w="80"/>
+              <w:left w:type="dxa" w:w="120"/>
+              <w:bottom w:type="dxa" w:w="80"/>
+              <w:right w:type="dxa" w:w="120"/>
+            </w:tcMar>
+            <w:vAlign w:val="center"/>
+          </w:tcPr>
+          <w:p>
+            <w:pPr>
+              <w:spacing w:after="0" w:line="260"/>
+            </w:pPr>
+            <w:r>
+              <w:rPr>
+                <w:sz w:val="20"/>
+                <w:szCs w:val="20"/>
+              </w:rPr>
+              <w:t xml:space="preserve">Al abrir la cámara desde la pantalla de instrucción.</w:t>
+            </w:r>
+          </w:p>
+        </w:tc>
+        <w:tc>
+          <w:tcPr>
+            <w:tcW w:type="dxa" w:w="3660"/>
             <w:tcBorders>
               <w:top w:val="single" w:color="D9DEE4" w:sz="4"/>
               <w:left w:val="single" w:color="D9DEE4" w:sz="4"/>
@@ -8140,7 +8846,7 @@
       <w:tr>
         <w:tc>
           <w:tcPr>
-            <w:tcW w:type="dxa" w:w="1800"/>
+            <w:tcW w:type="dxa" w:w="2400"/>
             <w:tcBorders>
               <w:top w:val="single" w:color="D9DEE4" w:sz="4"/>
               <w:left w:val="single" w:color="D9DEE4" w:sz="4"/>
@@ -8166,13 +8872,116 @@
                 <w:sz w:val="20"/>
                 <w:szCs w:val="20"/>
               </w:rPr>
+              <w:t xml:space="preserve">Cámara (selfie)</w:t>
+            </w:r>
+          </w:p>
+        </w:tc>
+        <w:tc>
+          <w:tcPr>
+            <w:tcW w:type="dxa" w:w="3300"/>
+            <w:tcBorders>
+              <w:top w:val="single" w:color="D9DEE4" w:sz="4"/>
+              <w:left w:val="single" w:color="D9DEE4" w:sz="4"/>
+              <w:bottom w:val="single" w:color="D9DEE4" w:sz="4"/>
+              <w:right w:val="single" w:color="D9DEE4" w:sz="4"/>
+            </w:tcBorders>
+            <w:tcMar>
+              <w:top w:type="dxa" w:w="80"/>
+              <w:left w:type="dxa" w:w="120"/>
+              <w:bottom w:type="dxa" w:w="80"/>
+              <w:right w:type="dxa" w:w="120"/>
+            </w:tcMar>
+            <w:vAlign w:val="center"/>
+          </w:tcPr>
+          <w:p>
+            <w:pPr>
+              <w:spacing w:after="0" w:line="260"/>
+            </w:pPr>
+            <w:r>
+              <w:rPr>
+                <w:sz w:val="20"/>
+                <w:szCs w:val="20"/>
+              </w:rPr>
+              <w:t xml:space="preserve">Se abre de inmediato al llegar al paso, sin pantalla de instrucción previa.</w:t>
+            </w:r>
+          </w:p>
+        </w:tc>
+        <w:tc>
+          <w:tcPr>
+            <w:tcW w:type="dxa" w:w="3660"/>
+            <w:tcBorders>
+              <w:top w:val="single" w:color="D9DEE4" w:sz="4"/>
+              <w:left w:val="single" w:color="D9DEE4" w:sz="4"/>
+              <w:bottom w:val="single" w:color="D9DEE4" w:sz="4"/>
+              <w:right w:val="single" w:color="D9DEE4" w:sz="4"/>
+            </w:tcBorders>
+            <w:tcMar>
+              <w:top w:type="dxa" w:w="80"/>
+              <w:left w:type="dxa" w:w="120"/>
+              <w:bottom w:type="dxa" w:w="80"/>
+              <w:right w:type="dxa" w:w="120"/>
+            </w:tcMar>
+            <w:vAlign w:val="center"/>
+          </w:tcPr>
+          <w:p>
+            <w:pPr>
+              <w:spacing w:after="0" w:line="260"/>
+            </w:pPr>
+            <w:r>
+              <w:rPr>
+                <w:b/>
+                <w:bCs/>
+                <w:sz w:val="20"/>
+                <w:szCs w:val="20"/>
+              </w:rPr>
+              <w:t xml:space="preserve">Sin alternativa de archivo: la selfie exige cámara.</w:t>
+            </w:r>
+            <w:r>
+              <w:rPr>
+                <w:sz w:val="20"/>
+                <w:szCs w:val="20"/>
+              </w:rPr>
+              <w:t xml:space="preserve"> La pantalla de error ofrece Reintentar y Regresar; debe conceder el permiso para continuar.</w:t>
+            </w:r>
+          </w:p>
+        </w:tc>
+      </w:tr>
+      <w:tr>
+        <w:tc>
+          <w:tcPr>
+            <w:tcW w:type="dxa" w:w="2400"/>
+            <w:tcBorders>
+              <w:top w:val="single" w:color="D9DEE4" w:sz="4"/>
+              <w:left w:val="single" w:color="D9DEE4" w:sz="4"/>
+              <w:bottom w:val="single" w:color="D9DEE4" w:sz="4"/>
+              <w:right w:val="single" w:color="D9DEE4" w:sz="4"/>
+            </w:tcBorders>
+            <w:tcMar>
+              <w:top w:type="dxa" w:w="80"/>
+              <w:left w:type="dxa" w:w="120"/>
+              <w:bottom w:type="dxa" w:w="80"/>
+              <w:right w:type="dxa" w:w="120"/>
+            </w:tcMar>
+            <w:vAlign w:val="center"/>
+          </w:tcPr>
+          <w:p>
+            <w:pPr>
+              <w:spacing w:after="0" w:line="260"/>
+            </w:pPr>
+            <w:r>
+              <w:rPr>
+                <w:b/>
+                <w:bCs/>
+                <w:sz w:val="20"/>
+                <w:szCs w:val="20"/>
+              </w:rPr>
               <w:t xml:space="preserve">Geolocalización</w:t>
             </w:r>
           </w:p>
         </w:tc>
         <w:tc>
           <w:tcPr>
-            <w:tcW w:type="dxa" w:w="4000"/>
+            <w:tcW w:type="dxa" w:w="3300"/>
             <w:tcBorders>
               <w:top w:val="single" w:color="D9DEE4" w:sz="4"/>
               <w:left w:val="single" w:color="D9DEE4" w:sz="4"/>
@@ -8202,7 +9011,7 @@
         </w:tc>
         <w:tc>
           <w:tcPr>
-            <w:tcW w:type="dxa" w:w="3560"/>
+            <w:tcW w:type="dxa" w:w="3660"/>
             <w:tcBorders>
               <w:top w:val="single" w:color="D9DEE4" w:sz="4"/>
               <w:left w:val="single" w:color="D9DEE4" w:sz="4"/>
@@ -8307,7 +9116,7 @@
         <w:spacing w:after="160" w:line="276"/>
       </w:pPr>
       <w:r>
-        <w:t xml:space="preserve">Sin configuración extra: el visor de PDF resuelve automáticamente el worker de </w:t>
+        <w:t xml:space="preserve">El SDK intenta resolver el worker de pdf.js vía </w:t>
       </w:r>
       <w:r>
         <w:rPr>
@@ -8317,10 +9126,30 @@
           <w:szCs w:val="20"/>
           <w:shd w:fill="F4F6F8" w:val="clear"/>
         </w:rPr>
-        <w:t xml:space="preserve">pdfjs-dist</w:t>
-      </w:r>
-      <w:r>
-        <w:t xml:space="preserve"> mediante </w:t>
+        <w:t xml:space="preserve">import.meta.url</w:t>
+      </w:r>
+      <w:r>
+        <w:t xml:space="preserve">, pero Vite y otros bundlers basados en esbuild pre-empaquetan las dependencias y no reescriben esa URL: la construcción </w:t>
+      </w:r>
+      <w:r>
+        <w:rPr>
+          <w:b/>
+          <w:bCs/>
+        </w:rPr>
+        <w:t xml:space="preserve">no lanza ningún error</w:t>
+      </w:r>
+      <w:r>
+        <w:t xml:space="preserve">, produce una URL que apunta a un 404 en runtime. Cuando eso pasa, el visor lo detecta y </w:t>
+      </w:r>
+      <w:r>
+        <w:rPr>
+          <w:b/>
+          <w:bCs/>
+        </w:rPr>
+        <w:t xml:space="preserve">reintenta automáticamente una vez</w:t>
+      </w:r>
+      <w:r>
+        <w:t xml:space="preserve"> sirviendo el worker desde </w:t>
       </w:r>
       <w:r>
         <w:rPr>
@@ -8330,10 +9159,10 @@
           <w:szCs w:val="20"/>
           <w:shd w:fill="F4F6F8" w:val="clear"/>
         </w:rPr>
-        <w:t xml:space="preserve">import.meta.url</w:t>
-      </w:r>
-      <w:r>
-        <w:t xml:space="preserve">.</w:t>
+        <w:t xml:space="preserve">/digid-scan/pdf.worker.min.mjs</w:t>
+      </w:r>
+      <w:r>
+        <w:t xml:space="preserve">, sin que el integrador haga nada — con la condición de que esa ruta esté servida (sección 10.2). Si no la sirves, o prefieres configurar el worker desde el arranque sin depender del reintento, usa una de las opciones de la sección siguiente.</w:t>
       </w:r>
     </w:p>
     <w:p>
@@ -8341,7 +9170,7 @@
         <w:pStyle w:val="Heading2"/>
       </w:pPr>
       <w:r>
-        <w:t xml:space="preserve">10.2 Consumidores CommonJS</w:t>
+        <w:t xml:space="preserve">10.2 Worker del visor PDF (todos los proyectos)</w:t>
       </w:r>
     </w:p>
     <w:p>
@@ -8349,7 +9178,7 @@
         <w:spacing w:after="160" w:line="276"/>
       </w:pPr>
       <w:r>
-        <w:t xml:space="preserve">En el build CommonJS </w:t>
+        <w:t xml:space="preserve">Dos formas de configurarlo explícitamente — basta con una, y si ya sirves </w:t>
       </w:r>
       <w:r>
         <w:rPr>
@@ -8359,10 +9188,10 @@
           <w:szCs w:val="20"/>
           <w:shd w:fill="F4F6F8" w:val="clear"/>
         </w:rPr>
-        <w:t xml:space="preserve">import.meta</w:t>
-      </w:r>
-      <w:r>
-        <w:t xml:space="preserve"> no existe, así que el worker de pdf.js no puede resolverse solo. Opciones:</w:t>
+        <w:t xml:space="preserve">scan-assets/</w:t>
+      </w:r>
+      <w:r>
+        <w:t xml:space="preserve"> (sección 1.3) no necesitas hacer nada más, porque esa carpeta incluye el worker desde esta versión:</w:t>
       </w:r>
     </w:p>
     <w:p>
@@ -8375,7 +9204,11 @@
         <w:spacing w:after="100" w:line="276"/>
       </w:pPr>
       <w:r>
-        <w:t xml:space="preserve">Sirve </w:t>
+        <w:rPr>
+          <w:b/>
+          <w:bCs/>
+        </w:rPr>
+        <w:t xml:space="preserve">Prop </w:t>
       </w:r>
       <w:r>
         <w:rPr>
@@ -8385,10 +9218,14 @@
           <w:szCs w:val="20"/>
           <w:shd w:fill="F4F6F8" w:val="clear"/>
         </w:rPr>
-        <w:t xml:space="preserve">pdfjs-dist/build/pdf.worker.min.mjs</w:t>
-      </w:r>
-      <w:r>
-        <w:t xml:space="preserve"> como asset estático y pásalo al componente </w:t>
+        <w:t xml:space="preserve">pdfWorkerUrl</w:t>
+      </w:r>
+      <w:r>
+        <w:rPr>
+          <w:b/>
+          <w:bCs/>
+        </w:rPr>
+        <w:t xml:space="preserve"> en </w:t>
       </w:r>
       <w:r>
         <w:rPr>
@@ -8398,23 +9235,29 @@
           <w:szCs w:val="20"/>
           <w:shd w:fill="F4F6F8" w:val="clear"/>
         </w:rPr>
-        <w:t xml:space="preserve">PdfViewer</w:t>
-      </w:r>
-      <w:r>
-        <w:t xml:space="preserve"> mediante la prop </w:t>
-      </w:r>
-      <w:r>
-        <w:rPr>
-          <w:rFonts w:ascii="Consolas" w:cs="Consolas" w:eastAsia="Consolas" w:hAnsi="Consolas"/>
-          <w:color w:val="111928"/>
-          <w:sz w:val="20"/>
-          <w:szCs w:val="20"/>
-          <w:shd w:fill="F4F6F8" w:val="clear"/>
-        </w:rPr>
-        <w:t xml:space="preserve">workerSrc</w:t>
-      </w:r>
-      <w:r>
-        <w:t xml:space="preserve">, o</w:t>
+        <w:t xml:space="preserve">&lt;FirmaAutografa&gt;</w:t>
+      </w:r>
+      <w:r>
+        <w:t xml:space="preserve"> — la forma recomendada.</w:t>
+      </w:r>
+    </w:p>
+    <w:p>
+      <w:pPr>
+        <w:pBdr>
+          <w:left w:val="single" w:color="6AC1B4" w:sz="12"/>
+        </w:pBdr>
+        <w:shd w:fill="F4F6F8" w:val="clear"/>
+        <w:spacing w:after="200" w:before="0" w:line="240"/>
+        <w:ind w:left="240" w:right="240"/>
+      </w:pPr>
+      <w:r>
+        <w:rPr>
+          <w:rFonts w:ascii="Consolas" w:cs="Consolas" w:eastAsia="Consolas" w:hAnsi="Consolas"/>
+          <w:color w:val="111928"/>
+          <w:sz w:val="18"/>
+          <w:szCs w:val="18"/>
+        </w:rPr>
+        <w:t xml:space="preserve">&lt;FirmaAutografa token={token} pdfWorkerUrl="/digid-scan/pdf.worker.min.mjs" /&gt;</w:t>
       </w:r>
     </w:p>
     <w:p>
@@ -8427,7 +9270,11 @@
         <w:spacing w:after="100" w:line="276"/>
       </w:pPr>
       <w:r>
-        <w:t xml:space="preserve">configura </w:t>
+        <w:rPr>
+          <w:b/>
+          <w:bCs/>
+        </w:rPr>
+        <w:t xml:space="preserve">Prop </w:t>
       </w:r>
       <w:r>
         <w:rPr>
@@ -8437,10 +9284,14 @@
           <w:szCs w:val="20"/>
           <w:shd w:fill="F4F6F8" w:val="clear"/>
         </w:rPr>
-        <w:t xml:space="preserve">GlobalWorkerOptions.workerSrc</w:t>
-      </w:r>
-      <w:r>
-        <w:t xml:space="preserve"> de </w:t>
+        <w:t xml:space="preserve">workerSrc</w:t>
+      </w:r>
+      <w:r>
+        <w:rPr>
+          <w:b/>
+          <w:bCs/>
+        </w:rPr>
+        <w:t xml:space="preserve"> en </w:t>
       </w:r>
       <w:r>
         <w:rPr>
@@ -8450,6 +9301,105 @@
           <w:szCs w:val="20"/>
           <w:shd w:fill="F4F6F8" w:val="clear"/>
         </w:rPr>
+        <w:t xml:space="preserve">PdfViewer</w:t>
+      </w:r>
+      <w:r>
+        <w:t xml:space="preserve"> — si usas ese componente por separado, fuera de </w:t>
+      </w:r>
+      <w:r>
+        <w:rPr>
+          <w:rFonts w:ascii="Consolas" w:cs="Consolas" w:eastAsia="Consolas" w:hAnsi="Consolas"/>
+          <w:color w:val="111928"/>
+          <w:sz w:val="20"/>
+          <w:szCs w:val="20"/>
+          <w:shd w:fill="F4F6F8" w:val="clear"/>
+        </w:rPr>
+        <w:t xml:space="preserve">&lt;FirmaAutografa&gt;</w:t>
+      </w:r>
+      <w:r>
+        <w:t xml:space="preserve">.</w:t>
+      </w:r>
+    </w:p>
+    <w:p>
+      <w:pPr>
+        <w:pBdr>
+          <w:left w:val="single" w:color="6AC1B4" w:sz="12"/>
+        </w:pBdr>
+        <w:shd w:fill="F4F6F8" w:val="clear"/>
+        <w:spacing w:after="200" w:before="0" w:line="240"/>
+        <w:ind w:left="240" w:right="240"/>
+      </w:pPr>
+      <w:r>
+        <w:rPr>
+          <w:rFonts w:ascii="Consolas" w:cs="Consolas" w:eastAsia="Consolas" w:hAnsi="Consolas"/>
+          <w:color w:val="111928"/>
+          <w:sz w:val="18"/>
+          <w:szCs w:val="18"/>
+        </w:rPr>
+        <w:t xml:space="preserve">&lt;PdfViewer url={pdfUrl} workerSrc="/digid-scan/pdf.worker.min.mjs" /&gt;</w:t>
+      </w:r>
+    </w:p>
+    <w:p>
+      <w:pPr>
+        <w:spacing w:after="160" w:line="276"/>
+      </w:pPr>
+      <w:r>
+        <w:rPr>
+          <w:b/>
+          <w:bCs/>
+        </w:rPr>
+        <w:t xml:space="preserve">Consumidores CommonJS</w:t>
+      </w:r>
+      <w:r>
+        <w:t xml:space="preserve"> (Jest con transform CJS, SSR Node, bundlers legados): en el build </w:t>
+      </w:r>
+      <w:r>
+        <w:rPr>
+          <w:rFonts w:ascii="Consolas" w:cs="Consolas" w:eastAsia="Consolas" w:hAnsi="Consolas"/>
+          <w:color w:val="111928"/>
+          <w:sz w:val="20"/>
+          <w:szCs w:val="20"/>
+          <w:shd w:fill="F4F6F8" w:val="clear"/>
+        </w:rPr>
+        <w:t xml:space="preserve">.cjs</w:t>
+      </w:r>
+      <w:r>
+        <w:t xml:space="preserve"> </w:t>
+      </w:r>
+      <w:r>
+        <w:rPr>
+          <w:rFonts w:ascii="Consolas" w:cs="Consolas" w:eastAsia="Consolas" w:hAnsi="Consolas"/>
+          <w:color w:val="111928"/>
+          <w:sz w:val="20"/>
+          <w:szCs w:val="20"/>
+          <w:shd w:fill="F4F6F8" w:val="clear"/>
+        </w:rPr>
+        <w:t xml:space="preserve">import.meta</w:t>
+      </w:r>
+      <w:r>
+        <w:t xml:space="preserve"> no existe, así que la resolución automática siempre falla ahí — una de las dos props de arriba es obligatoria, o configura </w:t>
+      </w:r>
+      <w:r>
+        <w:rPr>
+          <w:rFonts w:ascii="Consolas" w:cs="Consolas" w:eastAsia="Consolas" w:hAnsi="Consolas"/>
+          <w:color w:val="111928"/>
+          <w:sz w:val="20"/>
+          <w:szCs w:val="20"/>
+          <w:shd w:fill="F4F6F8" w:val="clear"/>
+        </w:rPr>
+        <w:t xml:space="preserve">GlobalWorkerOptions.workerSrc</w:t>
+      </w:r>
+      <w:r>
+        <w:t xml:space="preserve"> de </w:t>
+      </w:r>
+      <w:r>
+        <w:rPr>
+          <w:rFonts w:ascii="Consolas" w:cs="Consolas" w:eastAsia="Consolas" w:hAnsi="Consolas"/>
+          <w:color w:val="111928"/>
+          <w:sz w:val="20"/>
+          <w:szCs w:val="20"/>
+          <w:shd w:fill="F4F6F8" w:val="clear"/>
+        </w:rPr>
         <w:t xml:space="preserve">pdfjs-dist</w:t>
       </w:r>
       <w:r>
@@ -8461,7 +9411,33 @@
         <w:spacing w:after="160" w:line="276"/>
       </w:pPr>
       <w:r>
-        <w:t xml:space="preserve">Si no lo configuras, el visor muestra su estado de error y registra en consola un mensaje indicando exactamente esto.</w:t>
+        <w:t xml:space="preserve">Sin ninguna de estas opciones y sin </w:t>
+      </w:r>
+      <w:r>
+        <w:rPr>
+          <w:rFonts w:ascii="Consolas" w:cs="Consolas" w:eastAsia="Consolas" w:hAnsi="Consolas"/>
+          <w:color w:val="111928"/>
+          <w:sz w:val="20"/>
+          <w:szCs w:val="20"/>
+          <w:shd w:fill="F4F6F8" w:val="clear"/>
+        </w:rPr>
+        <w:t xml:space="preserve">scan-assets/</w:t>
+      </w:r>
+      <w:r>
+        <w:t xml:space="preserve"> servido, el visor igual intenta el reintento a </w:t>
+      </w:r>
+      <w:r>
+        <w:rPr>
+          <w:rFonts w:ascii="Consolas" w:cs="Consolas" w:eastAsia="Consolas" w:hAnsi="Consolas"/>
+          <w:color w:val="111928"/>
+          <w:sz w:val="20"/>
+          <w:szCs w:val="20"/>
+          <w:shd w:fill="F4F6F8" w:val="clear"/>
+        </w:rPr>
+        <w:t xml:space="preserve">/digid-scan/pdf.worker.min.mjs</w:t>
+      </w:r>
+      <w:r>
+        <w:t xml:space="preserve">; como esa ruta tampoco existe en tu servidor, también falla y el visor muestra su estado de error.</w:t>
       </w:r>
     </w:p>
     <w:p>
@@ -8905,33 +9881,8 @@
                 <w:sz w:val="20"/>
                 <w:szCs w:val="20"/>
               </w:rPr>
-              <w:t xml:space="preserve">Solicita a Digid el alta de tu dominio exacto (esquema + subdominio).</w:t>
-            </w:r>
-          </w:p>
-        </w:tc>
-      </w:tr>
-      <w:tr>
-        <w:tc>
-          <w:tcPr>
-            <w:tcW w:type="dxa" w:w="3120"/>
-            <w:tcBorders>
-              <w:top w:val="single" w:color="D9DEE4" w:sz="4"/>
-              <w:left w:val="single" w:color="D9DEE4" w:sz="4"/>
-              <w:bottom w:val="single" w:color="D9DEE4" w:sz="4"/>
-              <w:right w:val="single" w:color="D9DEE4" w:sz="4"/>
-            </w:tcBorders>
-            <w:tcMar>
-              <w:top w:type="dxa" w:w="80"/>
-              <w:left w:type="dxa" w:w="120"/>
-              <w:bottom w:type="dxa" w:w="80"/>
-              <w:right w:type="dxa" w:w="120"/>
-            </w:tcMar>
-            <w:vAlign w:val="center"/>
-          </w:tcPr>
-          <w:p>
-            <w:pPr>
-              <w:spacing w:after="0" w:line="260"/>
-            </w:pPr>
+              <w:t xml:space="preserve">Solicita a Digid el alta de tu dominio exacto. Alternativa: el proxy opcional de la sección 6.3 con </w:t>
+            </w:r>
             <w:r>
               <w:rPr>
                 <w:rFonts w:ascii="Consolas" w:cs="Consolas" w:eastAsia="Consolas" w:hAnsi="Consolas"/>
@@ -8940,14 +9891,62 @@
                 <w:szCs w:val="18"/>
                 <w:shd w:fill="F4F6F8" w:val="clear"/>
               </w:rPr>
-              <w:t xml:space="preserve">onError</w:t>
-            </w:r>
-            <w:r>
-              <w:rPr>
-                <w:sz w:val="20"/>
-                <w:szCs w:val="20"/>
-              </w:rPr>
-              <w:t xml:space="preserve"> con </w:t>
+              <w:t xml:space="preserve">baseUrl=""</w:t>
+            </w:r>
+            <w:r>
+              <w:rPr>
+                <w:sz w:val="20"/>
+                <w:szCs w:val="20"/>
+              </w:rPr>
+              <w:t xml:space="preserve">.</w:t>
+            </w:r>
+          </w:p>
+        </w:tc>
+      </w:tr>
+      <w:tr>
+        <w:tc>
+          <w:tcPr>
+            <w:tcW w:type="dxa" w:w="3120"/>
+            <w:tcBorders>
+              <w:top w:val="single" w:color="D9DEE4" w:sz="4"/>
+              <w:left w:val="single" w:color="D9DEE4" w:sz="4"/>
+              <w:bottom w:val="single" w:color="D9DEE4" w:sz="4"/>
+              <w:right w:val="single" w:color="D9DEE4" w:sz="4"/>
+            </w:tcBorders>
+            <w:tcMar>
+              <w:top w:type="dxa" w:w="80"/>
+              <w:left w:type="dxa" w:w="120"/>
+              <w:bottom w:type="dxa" w:w="80"/>
+              <w:right w:type="dxa" w:w="120"/>
+            </w:tcMar>
+            <w:vAlign w:val="center"/>
+          </w:tcPr>
+          <w:p>
+            <w:pPr>
+              <w:spacing w:after="0" w:line="260"/>
+            </w:pPr>
+            <w:r>
+              <w:rPr>
+                <w:sz w:val="20"/>
+                <w:szCs w:val="20"/>
+              </w:rPr>
+              <w:t xml:space="preserve">El visor del PDF se queda en </w:t>
+            </w:r>
+            <w:r>
+              <w:rPr>
+                <w:b/>
+                <w:bCs/>
+                <w:sz w:val="20"/>
+                <w:szCs w:val="20"/>
+              </w:rPr>
+              <w:t xml:space="preserve">"Página de 0"</w:t>
+            </w:r>
+            <w:r>
+              <w:rPr>
+                <w:sz w:val="20"/>
+                <w:szCs w:val="20"/>
+              </w:rPr>
+              <w:t xml:space="preserve"> sin mensaje de error, con dos peticiones 404 a </w:t>
             </w:r>
             <w:r>
               <w:rPr>
@@ -8957,7 +9956,14 @@
                 <w:szCs w:val="18"/>
                 <w:shd w:fill="F4F6F8" w:val="clear"/>
               </w:rPr>
-              <w:t xml:space="preserve">INVALID_TOKEN</w:t>
+              <w:t xml:space="preserve">pdf.worker.min.mjs</w:t>
+            </w:r>
+            <w:r>
+              <w:rPr>
+                <w:sz w:val="20"/>
+                <w:szCs w:val="20"/>
+              </w:rPr>
+              <w:t xml:space="preserve"> en la pestaña Red</w:t>
             </w:r>
           </w:p>
         </w:tc>
@@ -8987,185 +9993,8 @@
                 <w:sz w:val="20"/>
                 <w:szCs w:val="20"/>
               </w:rPr>
-              <w:t xml:space="preserve">Token mal copiado, vencido, o proceso ya cerrado</w:t>
-            </w:r>
-          </w:p>
-        </w:tc>
-        <w:tc>
-          <w:tcPr>
-            <w:tcW w:type="dxa" w:w="3120"/>
-            <w:tcBorders>
-              <w:top w:val="single" w:color="D9DEE4" w:sz="4"/>
-              <w:left w:val="single" w:color="D9DEE4" w:sz="4"/>
-              <w:bottom w:val="single" w:color="D9DEE4" w:sz="4"/>
-              <w:right w:val="single" w:color="D9DEE4" w:sz="4"/>
-            </w:tcBorders>
-            <w:tcMar>
-              <w:top w:type="dxa" w:w="80"/>
-              <w:left w:type="dxa" w:w="120"/>
-              <w:bottom w:type="dxa" w:w="80"/>
-              <w:right w:type="dxa" w:w="120"/>
-            </w:tcMar>
-            <w:vAlign w:val="center"/>
-          </w:tcPr>
-          <w:p>
-            <w:pPr>
-              <w:spacing w:after="0" w:line="260"/>
-            </w:pPr>
-            <w:r>
-              <w:rPr>
-                <w:sz w:val="20"/>
-                <w:szCs w:val="20"/>
-              </w:rPr>
-              <w:t xml:space="preserve">Verifica que pasas el token completo y que el documento sigue vigente.</w:t>
-            </w:r>
-          </w:p>
-        </w:tc>
-      </w:tr>
-      <w:tr>
-        <w:tc>
-          <w:tcPr>
-            <w:tcW w:type="dxa" w:w="3120"/>
-            <w:tcBorders>
-              <w:top w:val="single" w:color="D9DEE4" w:sz="4"/>
-              <w:left w:val="single" w:color="D9DEE4" w:sz="4"/>
-              <w:bottom w:val="single" w:color="D9DEE4" w:sz="4"/>
-              <w:right w:val="single" w:color="D9DEE4" w:sz="4"/>
-            </w:tcBorders>
-            <w:tcMar>
-              <w:top w:type="dxa" w:w="80"/>
-              <w:left w:type="dxa" w:w="120"/>
-              <w:bottom w:type="dxa" w:w="80"/>
-              <w:right w:type="dxa" w:w="120"/>
-            </w:tcMar>
-            <w:vAlign w:val="center"/>
-          </w:tcPr>
-          <w:p>
-            <w:pPr>
-              <w:spacing w:after="0" w:line="260"/>
-            </w:pPr>
-            <w:r>
-              <w:rPr>
-                <w:sz w:val="20"/>
-                <w:szCs w:val="20"/>
-              </w:rPr>
-              <w:t xml:space="preserve">La cámara no abre</w:t>
-            </w:r>
-          </w:p>
-        </w:tc>
-        <w:tc>
-          <w:tcPr>
-            <w:tcW w:type="dxa" w:w="3120"/>
-            <w:tcBorders>
-              <w:top w:val="single" w:color="D9DEE4" w:sz="4"/>
-              <w:left w:val="single" w:color="D9DEE4" w:sz="4"/>
-              <w:bottom w:val="single" w:color="D9DEE4" w:sz="4"/>
-              <w:right w:val="single" w:color="D9DEE4" w:sz="4"/>
-            </w:tcBorders>
-            <w:tcMar>
-              <w:top w:type="dxa" w:w="80"/>
-              <w:left w:type="dxa" w:w="120"/>
-              <w:bottom w:type="dxa" w:w="80"/>
-              <w:right w:type="dxa" w:w="120"/>
-            </w:tcMar>
-            <w:vAlign w:val="center"/>
-          </w:tcPr>
-          <w:p>
-            <w:pPr>
-              <w:spacing w:after="0" w:line="260"/>
-            </w:pPr>
-            <w:r>
-              <w:rPr>
-                <w:sz w:val="20"/>
-                <w:szCs w:val="20"/>
-              </w:rPr>
-              <w:t xml:space="preserve">Página sin HTTPS, o permiso denegado</w:t>
-            </w:r>
-          </w:p>
-        </w:tc>
-        <w:tc>
-          <w:tcPr>
-            <w:tcW w:type="dxa" w:w="3120"/>
-            <w:tcBorders>
-              <w:top w:val="single" w:color="D9DEE4" w:sz="4"/>
-              <w:left w:val="single" w:color="D9DEE4" w:sz="4"/>
-              <w:bottom w:val="single" w:color="D9DEE4" w:sz="4"/>
-              <w:right w:val="single" w:color="D9DEE4" w:sz="4"/>
-            </w:tcBorders>
-            <w:tcMar>
-              <w:top w:type="dxa" w:w="80"/>
-              <w:left w:type="dxa" w:w="120"/>
-              <w:bottom w:type="dxa" w:w="80"/>
-              <w:right w:type="dxa" w:w="120"/>
-            </w:tcMar>
-            <w:vAlign w:val="center"/>
-          </w:tcPr>
-          <w:p>
-            <w:pPr>
-              <w:spacing w:after="0" w:line="260"/>
-            </w:pPr>
-            <w:r>
-              <w:rPr>
-                <w:sz w:val="20"/>
-                <w:szCs w:val="20"/>
-              </w:rPr>
-              <w:t xml:space="preserve">Sirve por HTTPS; el firmante siempre puede subir archivo.</w:t>
-            </w:r>
-          </w:p>
-        </w:tc>
-      </w:tr>
-      <w:tr>
-        <w:tc>
-          <w:tcPr>
-            <w:tcW w:type="dxa" w:w="3120"/>
-            <w:tcBorders>
-              <w:top w:val="single" w:color="D9DEE4" w:sz="4"/>
-              <w:left w:val="single" w:color="D9DEE4" w:sz="4"/>
-              <w:bottom w:val="single" w:color="D9DEE4" w:sz="4"/>
-              <w:right w:val="single" w:color="D9DEE4" w:sz="4"/>
-            </w:tcBorders>
-            <w:tcMar>
-              <w:top w:type="dxa" w:w="80"/>
-              <w:left w:type="dxa" w:w="120"/>
-              <w:bottom w:type="dxa" w:w="80"/>
-              <w:right w:type="dxa" w:w="120"/>
-            </w:tcMar>
-            <w:vAlign w:val="center"/>
-          </w:tcPr>
-          <w:p>
-            <w:pPr>
-              <w:spacing w:after="0" w:line="260"/>
-            </w:pPr>
-            <w:r>
-              <w:rPr>
-                <w:sz w:val="20"/>
-                <w:szCs w:val="20"/>
-              </w:rPr>
-              <w:t xml:space="preserve">En INE no hay detección en vivo y en consola aparece "Worker de escaneo no disponible"</w:t>
-            </w:r>
-          </w:p>
-        </w:tc>
-        <w:tc>
-          <w:tcPr>
-            <w:tcW w:type="dxa" w:w="3120"/>
-            <w:tcBorders>
-              <w:top w:val="single" w:color="D9DEE4" w:sz="4"/>
-              <w:left w:val="single" w:color="D9DEE4" w:sz="4"/>
-              <w:bottom w:val="single" w:color="D9DEE4" w:sz="4"/>
-              <w:right w:val="single" w:color="D9DEE4" w:sz="4"/>
-            </w:tcBorders>
-            <w:tcMar>
-              <w:top w:type="dxa" w:w="80"/>
-              <w:left w:type="dxa" w:w="120"/>
-              <w:bottom w:type="dxa" w:w="80"/>
-              <w:right w:type="dxa" w:w="120"/>
-            </w:tcMar>
-            <w:vAlign w:val="center"/>
-          </w:tcPr>
-          <w:p>
-            <w:pPr>
-              <w:spacing w:after="0" w:line="260"/>
-            </w:pPr>
+              <w:t xml:space="preserve">El worker de pdf.js no se resolvió (Vite/esbuild) y tampoco sirves </w:t>
+            </w:r>
             <w:r>
               <w:rPr>
                 <w:rFonts w:ascii="Consolas" w:cs="Consolas" w:eastAsia="Consolas" w:hAnsi="Consolas"/>
@@ -9181,7 +10010,7 @@
                 <w:sz w:val="20"/>
                 <w:szCs w:val="20"/>
               </w:rPr>
-              <w:t xml:space="preserve"> no se está sirviendo en la URL esperada</w:t>
+              <w:t xml:space="preserve">, así que el reintento automático también 404ea</w:t>
             </w:r>
           </w:p>
         </w:tc>
@@ -9211,7 +10040,7 @@
                 <w:sz w:val="20"/>
                 <w:szCs w:val="20"/>
               </w:rPr>
-              <w:t xml:space="preserve">Copia la carpeta (sección 4.3) y comprueba que </w:t>
+              <w:t xml:space="preserve">Sirve </w:t>
             </w:r>
             <w:r>
               <w:rPr>
@@ -9221,14 +10050,14 @@
                 <w:szCs w:val="18"/>
                 <w:shd w:fill="F4F6F8" w:val="clear"/>
               </w:rPr>
-              <w:t xml:space="preserve">/digid-scan/scan-worker.js</w:t>
-            </w:r>
-            <w:r>
-              <w:rPr>
-                <w:sz w:val="20"/>
-                <w:szCs w:val="20"/>
-              </w:rPr>
-              <w:t xml:space="preserve"> responde 200. Si usas otra ruta, indícala en </w:t>
+              <w:t xml:space="preserve">scan-assets/</w:t>
+            </w:r>
+            <w:r>
+              <w:rPr>
+                <w:sz w:val="20"/>
+                <w:szCs w:val="20"/>
+              </w:rPr>
+              <w:t xml:space="preserve"> (ya incluye el worker) o pasa </w:t>
             </w:r>
             <w:r>
               <w:rPr>
@@ -9238,14 +10067,14 @@
                 <w:szCs w:val="18"/>
                 <w:shd w:fill="F4F6F8" w:val="clear"/>
               </w:rPr>
-              <w:t xml:space="preserve">scanAssets.workerUrl</w:t>
-            </w:r>
-            <w:r>
-              <w:rPr>
-                <w:sz w:val="20"/>
-                <w:szCs w:val="20"/>
-              </w:rPr>
-              <w:t xml:space="preserve">.</w:t>
+              <w:t xml:space="preserve">pdfWorkerUrl</w:t>
+            </w:r>
+            <w:r>
+              <w:rPr>
+                <w:sz w:val="20"/>
+                <w:szCs w:val="20"/>
+              </w:rPr>
+              <w:t xml:space="preserve"> — sección 10.2.</w:t>
             </w:r>
           </w:p>
         </w:tc>
@@ -9277,31 +10106,8 @@
                 <w:sz w:val="20"/>
                 <w:szCs w:val="20"/>
               </w:rPr>
-              <w:t xml:space="preserve">Funcionaba en local y tras desplegar dejó de funcionar el escáner</w:t>
-            </w:r>
-          </w:p>
-        </w:tc>
-        <w:tc>
-          <w:tcPr>
-            <w:tcW w:type="dxa" w:w="3120"/>
-            <w:tcBorders>
-              <w:top w:val="single" w:color="D9DEE4" w:sz="4"/>
-              <w:left w:val="single" w:color="D9DEE4" w:sz="4"/>
-              <w:bottom w:val="single" w:color="D9DEE4" w:sz="4"/>
-              <w:right w:val="single" w:color="D9DEE4" w:sz="4"/>
-            </w:tcBorders>
-            <w:tcMar>
-              <w:top w:type="dxa" w:w="80"/>
-              <w:left w:type="dxa" w:w="120"/>
-              <w:bottom w:type="dxa" w:w="80"/>
-              <w:right w:type="dxa" w:w="120"/>
-            </w:tcMar>
-            <w:vAlign w:val="center"/>
-          </w:tcPr>
-          <w:p>
-            <w:pPr>
-              <w:spacing w:after="0" w:line="260"/>
-            </w:pPr>
+              <w:t xml:space="preserve">El PDF no carga y la petición a </w:t>
+            </w:r>
             <w:r>
               <w:rPr>
                 <w:rFonts w:ascii="Consolas" w:cs="Consolas" w:eastAsia="Consolas" w:hAnsi="Consolas"/>
@@ -9310,14 +10116,106 @@
                 <w:szCs w:val="18"/>
                 <w:shd w:fill="F4F6F8" w:val="clear"/>
               </w:rPr>
-              <w:t xml:space="preserve">npm ci</w:t>
-            </w:r>
-            <w:r>
-              <w:rPr>
-                <w:sz w:val="20"/>
-                <w:szCs w:val="20"/>
-              </w:rPr>
-              <w:t xml:space="preserve"> borró </w:t>
+              <w:t xml:space="preserve">document_pdf</w:t>
+            </w:r>
+            <w:r>
+              <w:rPr>
+                <w:sz w:val="20"/>
+                <w:szCs w:val="20"/>
+              </w:rPr>
+              <w:t xml:space="preserve"> aparece </w:t>
+            </w:r>
+            <w:r>
+              <w:rPr>
+                <w:b/>
+                <w:bCs/>
+                <w:sz w:val="20"/>
+                <w:szCs w:val="20"/>
+              </w:rPr>
+              <w:t xml:space="preserve">sin código de estado</w:t>
+            </w:r>
+            <w:r>
+              <w:rPr>
+                <w:sz w:val="20"/>
+                <w:szCs w:val="20"/>
+              </w:rPr>
+              <w:t xml:space="preserve"> en la pestaña Red, pero la URL sí funciona pegada directo en el navegador</w:t>
+            </w:r>
+          </w:p>
+        </w:tc>
+        <w:tc>
+          <w:tcPr>
+            <w:tcW w:type="dxa" w:w="3120"/>
+            <w:tcBorders>
+              <w:top w:val="single" w:color="D9DEE4" w:sz="4"/>
+              <w:left w:val="single" w:color="D9DEE4" w:sz="4"/>
+              <w:bottom w:val="single" w:color="D9DEE4" w:sz="4"/>
+              <w:right w:val="single" w:color="D9DEE4" w:sz="4"/>
+            </w:tcBorders>
+            <w:tcMar>
+              <w:top w:type="dxa" w:w="80"/>
+              <w:left w:type="dxa" w:w="120"/>
+              <w:bottom w:type="dxa" w:w="80"/>
+              <w:right w:type="dxa" w:w="120"/>
+            </w:tcMar>
+            <w:vAlign w:val="center"/>
+          </w:tcPr>
+          <w:p>
+            <w:pPr>
+              <w:spacing w:after="0" w:line="260"/>
+            </w:pPr>
+            <w:r>
+              <w:rPr>
+                <w:sz w:val="20"/>
+                <w:szCs w:val="20"/>
+              </w:rPr>
+              <w:t xml:space="preserve">Bloqueo CORS: el navegador descarta la respuesta — </w:t>
+            </w:r>
+            <w:r>
+              <w:rPr>
+                <w:b/>
+                <w:bCs/>
+                <w:sz w:val="20"/>
+                <w:szCs w:val="20"/>
+              </w:rPr>
+              <w:t xml:space="preserve">un 200 tampoco lo descarta</w:t>
+            </w:r>
+            <w:r>
+              <w:rPr>
+                <w:sz w:val="20"/>
+                <w:szCs w:val="20"/>
+              </w:rPr>
+              <w:t xml:space="preserve">, revisa la consola por avisos de CORS</w:t>
+            </w:r>
+          </w:p>
+        </w:tc>
+        <w:tc>
+          <w:tcPr>
+            <w:tcW w:type="dxa" w:w="3120"/>
+            <w:tcBorders>
+              <w:top w:val="single" w:color="D9DEE4" w:sz="4"/>
+              <w:left w:val="single" w:color="D9DEE4" w:sz="4"/>
+              <w:bottom w:val="single" w:color="D9DEE4" w:sz="4"/>
+              <w:right w:val="single" w:color="D9DEE4" w:sz="4"/>
+            </w:tcBorders>
+            <w:tcMar>
+              <w:top w:type="dxa" w:w="80"/>
+              <w:left w:type="dxa" w:w="120"/>
+              <w:bottom w:type="dxa" w:w="80"/>
+              <w:right w:type="dxa" w:w="120"/>
+            </w:tcMar>
+            <w:vAlign w:val="center"/>
+          </w:tcPr>
+          <w:p>
+            <w:pPr>
+              <w:spacing w:after="0" w:line="260"/>
+            </w:pPr>
+            <w:r>
+              <w:rPr>
+                <w:sz w:val="20"/>
+                <w:szCs w:val="20"/>
+              </w:rPr>
+              <w:t xml:space="preserve">Con backend y SDK actualizados, </w:t>
             </w:r>
             <w:r>
               <w:rPr>
@@ -9327,14 +10225,14 @@
                 <w:szCs w:val="18"/>
                 <w:shd w:fill="F4F6F8" w:val="clear"/>
               </w:rPr>
-              <w:t xml:space="preserve">node_modules</w:t>
-            </w:r>
-            <w:r>
-              <w:rPr>
-                <w:sz w:val="20"/>
-                <w:szCs w:val="20"/>
-              </w:rPr>
-              <w:t xml:space="preserve"> y con él la copia manual de </w:t>
+              <w:t xml:space="preserve">document_pdf</w:t>
+            </w:r>
+            <w:r>
+              <w:rPr>
+                <w:sz w:val="20"/>
+                <w:szCs w:val="20"/>
+              </w:rPr>
+              <w:t xml:space="preserve">/</w:t>
             </w:r>
             <w:r>
               <w:rPr>
@@ -9344,37 +10242,14 @@
                 <w:szCs w:val="18"/>
                 <w:shd w:fill="F4F6F8" w:val="clear"/>
               </w:rPr>
-              <w:t xml:space="preserve">scan-assets/</w:t>
-            </w:r>
-          </w:p>
-        </w:tc>
-        <w:tc>
-          <w:tcPr>
-            <w:tcW w:type="dxa" w:w="3120"/>
-            <w:tcBorders>
-              <w:top w:val="single" w:color="D9DEE4" w:sz="4"/>
-              <w:left w:val="single" w:color="D9DEE4" w:sz="4"/>
-              <w:bottom w:val="single" w:color="D9DEE4" w:sz="4"/>
-              <w:right w:val="single" w:color="D9DEE4" w:sz="4"/>
-            </w:tcBorders>
-            <w:tcMar>
-              <w:top w:type="dxa" w:w="80"/>
-              <w:left w:type="dxa" w:w="120"/>
-              <w:bottom w:type="dxa" w:w="80"/>
-              <w:right w:type="dxa" w:w="120"/>
-            </w:tcMar>
-            <w:vAlign w:val="center"/>
-          </w:tcPr>
-          <w:p>
-            <w:pPr>
-              <w:spacing w:after="0" w:line="260"/>
-            </w:pPr>
-            <w:r>
-              <w:rPr>
-                <w:sz w:val="20"/>
-                <w:szCs w:val="20"/>
-              </w:rPr>
-              <w:t xml:space="preserve">Engancha la copia al </w:t>
+              <w:t xml:space="preserve">signature_image</w:t>
+            </w:r>
+            <w:r>
+              <w:rPr>
+                <w:sz w:val="20"/>
+                <w:szCs w:val="20"/>
+              </w:rPr>
+              <w:t xml:space="preserve"> viven bajo </w:t>
             </w:r>
             <w:r>
               <w:rPr>
@@ -9384,14 +10259,14 @@
                 <w:szCs w:val="18"/>
                 <w:shd w:fill="F4F6F8" w:val="clear"/>
               </w:rPr>
-              <w:t xml:space="preserve">postinstall</w:t>
-            </w:r>
-            <w:r>
-              <w:rPr>
-                <w:sz w:val="20"/>
-                <w:szCs w:val="20"/>
-              </w:rPr>
-              <w:t xml:space="preserve"> (sección 4.3).</w:t>
+              <w:t xml:space="preserve">/api/*</w:t>
+            </w:r>
+            <w:r>
+              <w:rPr>
+                <w:sz w:val="20"/>
+                <w:szCs w:val="20"/>
+              </w:rPr>
+              <w:t xml:space="preserve"> y no dependen de CORS. Contra un backend viejo, usa el proxy opcional de la sección 6.3.</w:t>
             </w:r>
           </w:p>
         </w:tc>
@@ -9423,7 +10298,7 @@
                 <w:sz w:val="20"/>
                 <w:szCs w:val="20"/>
               </w:rPr>
-              <w:t xml:space="preserve">La selfie sí captura sola pero la INE no</w:t>
+              <w:t xml:space="preserve">El PDF no carga (token válido), sin los síntomas anteriores</w:t>
             </w:r>
           </w:p>
         </w:tc>
@@ -9453,37 +10328,7 @@
                 <w:sz w:val="20"/>
                 <w:szCs w:val="20"/>
               </w:rPr>
-              <w:t xml:space="preserve">Son dos mecanismos distintos: selfie usa MediaPipe (CDN); INE, el worker local de OpenCV</w:t>
-            </w:r>
-          </w:p>
-        </w:tc>
-        <w:tc>
-          <w:tcPr>
-            <w:tcW w:type="dxa" w:w="3120"/>
-            <w:tcBorders>
-              <w:top w:val="single" w:color="D9DEE4" w:sz="4"/>
-              <w:left w:val="single" w:color="D9DEE4" w:sz="4"/>
-              <w:bottom w:val="single" w:color="D9DEE4" w:sz="4"/>
-              <w:right w:val="single" w:color="D9DEE4" w:sz="4"/>
-            </w:tcBorders>
-            <w:tcMar>
-              <w:top w:type="dxa" w:w="80"/>
-              <w:left w:type="dxa" w:w="120"/>
-              <w:bottom w:type="dxa" w:w="80"/>
-              <w:right w:type="dxa" w:w="120"/>
-            </w:tcMar>
-            <w:vAlign w:val="center"/>
-          </w:tcPr>
-          <w:p>
-            <w:pPr>
-              <w:spacing w:after="0" w:line="260"/>
-            </w:pPr>
-            <w:r>
-              <w:rPr>
-                <w:sz w:val="20"/>
-                <w:szCs w:val="20"/>
-              </w:rPr>
-              <w:t xml:space="preserve">El síntoma apunta a </w:t>
+              <w:t xml:space="preserve">El backend de Digid aún no incluye los endpoints </w:t>
             </w:r>
             <w:r>
               <w:rPr>
@@ -9493,14 +10338,14 @@
                 <w:szCs w:val="18"/>
                 <w:shd w:fill="F4F6F8" w:val="clear"/>
               </w:rPr>
-              <w:t xml:space="preserve">scan-assets/</w:t>
-            </w:r>
-            <w:r>
-              <w:rPr>
-                <w:sz w:val="20"/>
-                <w:szCs w:val="20"/>
-              </w:rPr>
-              <w:t xml:space="preserve">, no a </w:t>
+              <w:t xml:space="preserve">document_pdf</w:t>
+            </w:r>
+            <w:r>
+              <w:rPr>
+                <w:sz w:val="20"/>
+                <w:szCs w:val="20"/>
+              </w:rPr>
+              <w:t xml:space="preserve">/</w:t>
             </w:r>
             <w:r>
               <w:rPr>
@@ -9510,14 +10355,37 @@
                 <w:szCs w:val="18"/>
                 <w:shd w:fill="F4F6F8" w:val="clear"/>
               </w:rPr>
-              <w:t xml:space="preserve">detectionAssets</w:t>
-            </w:r>
-            <w:r>
-              <w:rPr>
-                <w:sz w:val="20"/>
-                <w:szCs w:val="20"/>
-              </w:rPr>
-              <w:t xml:space="preserve">.</w:t>
+              <w:t xml:space="preserve">signature_image</w:t>
+            </w:r>
+          </w:p>
+        </w:tc>
+        <w:tc>
+          <w:tcPr>
+            <w:tcW w:type="dxa" w:w="3120"/>
+            <w:tcBorders>
+              <w:top w:val="single" w:color="D9DEE4" w:sz="4"/>
+              <w:left w:val="single" w:color="D9DEE4" w:sz="4"/>
+              <w:bottom w:val="single" w:color="D9DEE4" w:sz="4"/>
+              <w:right w:val="single" w:color="D9DEE4" w:sz="4"/>
+            </w:tcBorders>
+            <w:tcMar>
+              <w:top w:type="dxa" w:w="80"/>
+              <w:left w:type="dxa" w:w="120"/>
+              <w:bottom w:type="dxa" w:w="80"/>
+              <w:right w:type="dxa" w:w="120"/>
+            </w:tcMar>
+            <w:vAlign w:val="center"/>
+          </w:tcPr>
+          <w:p>
+            <w:pPr>
+              <w:spacing w:after="0" w:line="260"/>
+            </w:pPr>
+            <w:r>
+              <w:rPr>
+                <w:sz w:val="20"/>
+                <w:szCs w:val="20"/>
+              </w:rPr>
+              <w:t xml:space="preserve">Confirma con Digid la versión del backend, o usa el proxy opcional de la sección 6.3 mientras se actualiza.</w:t>
             </w:r>
           </w:p>
         </w:tc>
@@ -9544,73 +10412,6 @@
             <w:pPr>
               <w:spacing w:after="0" w:line="260"/>
             </w:pPr>
-            <w:r>
-              <w:rPr>
-                <w:sz w:val="20"/>
-                <w:szCs w:val="20"/>
-              </w:rPr>
-              <w:t xml:space="preserve">El PDF no se muestra</w:t>
-            </w:r>
-          </w:p>
-        </w:tc>
-        <w:tc>
-          <w:tcPr>
-            <w:tcW w:type="dxa" w:w="3120"/>
-            <w:tcBorders>
-              <w:top w:val="single" w:color="D9DEE4" w:sz="4"/>
-              <w:left w:val="single" w:color="D9DEE4" w:sz="4"/>
-              <w:bottom w:val="single" w:color="D9DEE4" w:sz="4"/>
-              <w:right w:val="single" w:color="D9DEE4" w:sz="4"/>
-            </w:tcBorders>
-            <w:tcMar>
-              <w:top w:type="dxa" w:w="80"/>
-              <w:left w:type="dxa" w:w="120"/>
-              <w:bottom w:type="dxa" w:w="80"/>
-              <w:right w:type="dxa" w:w="120"/>
-            </w:tcMar>
-            <w:vAlign w:val="center"/>
-          </w:tcPr>
-          <w:p>
-            <w:pPr>
-              <w:spacing w:after="0" w:line="260"/>
-            </w:pPr>
-            <w:r>
-              <w:rPr>
-                <w:sz w:val="20"/>
-                <w:szCs w:val="20"/>
-              </w:rPr>
-              <w:t xml:space="preserve">Worker de pdf.js no resuelto (build CJS) o PDF inaccesible</w:t>
-            </w:r>
-          </w:p>
-        </w:tc>
-        <w:tc>
-          <w:tcPr>
-            <w:tcW w:type="dxa" w:w="3120"/>
-            <w:tcBorders>
-              <w:top w:val="single" w:color="D9DEE4" w:sz="4"/>
-              <w:left w:val="single" w:color="D9DEE4" w:sz="4"/>
-              <w:bottom w:val="single" w:color="D9DEE4" w:sz="4"/>
-              <w:right w:val="single" w:color="D9DEE4" w:sz="4"/>
-            </w:tcBorders>
-            <w:tcMar>
-              <w:top w:type="dxa" w:w="80"/>
-              <w:left w:type="dxa" w:w="120"/>
-              <w:bottom w:type="dxa" w:w="80"/>
-              <w:right w:type="dxa" w:w="120"/>
-            </w:tcMar>
-            <w:vAlign w:val="center"/>
-          </w:tcPr>
-          <w:p>
-            <w:pPr>
-              <w:spacing w:after="0" w:line="260"/>
-            </w:pPr>
-            <w:r>
-              <w:rPr>
-                <w:sz w:val="20"/>
-                <w:szCs w:val="20"/>
-              </w:rPr>
-              <w:t xml:space="preserve">Ver sección 10.2; revisa en la pestaña Red si </w:t>
-            </w:r>
             <w:r>
               <w:rPr>
                 <w:rFonts w:ascii="Consolas" w:cs="Consolas" w:eastAsia="Consolas" w:hAnsi="Consolas"/>
@@ -9619,14 +10420,692 @@
                 <w:szCs w:val="18"/>
                 <w:shd w:fill="F4F6F8" w:val="clear"/>
               </w:rPr>
-              <w:t xml:space="preserve">/storage/files/...</w:t>
-            </w:r>
-            <w:r>
-              <w:rPr>
-                <w:sz w:val="20"/>
-                <w:szCs w:val="20"/>
-              </w:rPr>
-              <w:t xml:space="preserve"> responde 200.</w:t>
+              <w:t xml:space="preserve">onError</w:t>
+            </w:r>
+            <w:r>
+              <w:rPr>
+                <w:sz w:val="20"/>
+                <w:szCs w:val="20"/>
+              </w:rPr>
+              <w:t xml:space="preserve"> con </w:t>
+            </w:r>
+            <w:r>
+              <w:rPr>
+                <w:rFonts w:ascii="Consolas" w:cs="Consolas" w:eastAsia="Consolas" w:hAnsi="Consolas"/>
+                <w:color w:val="111928"/>
+                <w:sz w:val="18"/>
+                <w:szCs w:val="18"/>
+                <w:shd w:fill="F4F6F8" w:val="clear"/>
+              </w:rPr>
+              <w:t xml:space="preserve">INVALID_TOKEN</w:t>
+            </w:r>
+          </w:p>
+        </w:tc>
+        <w:tc>
+          <w:tcPr>
+            <w:tcW w:type="dxa" w:w="3120"/>
+            <w:tcBorders>
+              <w:top w:val="single" w:color="D9DEE4" w:sz="4"/>
+              <w:left w:val="single" w:color="D9DEE4" w:sz="4"/>
+              <w:bottom w:val="single" w:color="D9DEE4" w:sz="4"/>
+              <w:right w:val="single" w:color="D9DEE4" w:sz="4"/>
+            </w:tcBorders>
+            <w:tcMar>
+              <w:top w:type="dxa" w:w="80"/>
+              <w:left w:type="dxa" w:w="120"/>
+              <w:bottom w:type="dxa" w:w="80"/>
+              <w:right w:type="dxa" w:w="120"/>
+            </w:tcMar>
+            <w:vAlign w:val="center"/>
+          </w:tcPr>
+          <w:p>
+            <w:pPr>
+              <w:spacing w:after="0" w:line="260"/>
+            </w:pPr>
+            <w:r>
+              <w:rPr>
+                <w:sz w:val="20"/>
+                <w:szCs w:val="20"/>
+              </w:rPr>
+              <w:t xml:space="preserve">Token mal copiado, vencido, o proceso ya cerrado</w:t>
+            </w:r>
+          </w:p>
+        </w:tc>
+        <w:tc>
+          <w:tcPr>
+            <w:tcW w:type="dxa" w:w="3120"/>
+            <w:tcBorders>
+              <w:top w:val="single" w:color="D9DEE4" w:sz="4"/>
+              <w:left w:val="single" w:color="D9DEE4" w:sz="4"/>
+              <w:bottom w:val="single" w:color="D9DEE4" w:sz="4"/>
+              <w:right w:val="single" w:color="D9DEE4" w:sz="4"/>
+            </w:tcBorders>
+            <w:tcMar>
+              <w:top w:type="dxa" w:w="80"/>
+              <w:left w:type="dxa" w:w="120"/>
+              <w:bottom w:type="dxa" w:w="80"/>
+              <w:right w:type="dxa" w:w="120"/>
+            </w:tcMar>
+            <w:vAlign w:val="center"/>
+          </w:tcPr>
+          <w:p>
+            <w:pPr>
+              <w:spacing w:after="0" w:line="260"/>
+            </w:pPr>
+            <w:r>
+              <w:rPr>
+                <w:sz w:val="20"/>
+                <w:szCs w:val="20"/>
+              </w:rPr>
+              <w:t xml:space="preserve">Verifica que pasas el token completo y que el documento sigue vigente.</w:t>
+            </w:r>
+          </w:p>
+        </w:tc>
+      </w:tr>
+      <w:tr>
+        <w:tc>
+          <w:tcPr>
+            <w:tcW w:type="dxa" w:w="3120"/>
+            <w:tcBorders>
+              <w:top w:val="single" w:color="D9DEE4" w:sz="4"/>
+              <w:left w:val="single" w:color="D9DEE4" w:sz="4"/>
+              <w:bottom w:val="single" w:color="D9DEE4" w:sz="4"/>
+              <w:right w:val="single" w:color="D9DEE4" w:sz="4"/>
+            </w:tcBorders>
+            <w:tcMar>
+              <w:top w:type="dxa" w:w="80"/>
+              <w:left w:type="dxa" w:w="120"/>
+              <w:bottom w:type="dxa" w:w="80"/>
+              <w:right w:type="dxa" w:w="120"/>
+            </w:tcMar>
+            <w:vAlign w:val="center"/>
+          </w:tcPr>
+          <w:p>
+            <w:pPr>
+              <w:spacing w:after="0" w:line="260"/>
+            </w:pPr>
+            <w:r>
+              <w:rPr>
+                <w:sz w:val="20"/>
+                <w:szCs w:val="20"/>
+              </w:rPr>
+              <w:t xml:space="preserve">La cámara no abre (INE)</w:t>
+            </w:r>
+          </w:p>
+        </w:tc>
+        <w:tc>
+          <w:tcPr>
+            <w:tcW w:type="dxa" w:w="3120"/>
+            <w:tcBorders>
+              <w:top w:val="single" w:color="D9DEE4" w:sz="4"/>
+              <w:left w:val="single" w:color="D9DEE4" w:sz="4"/>
+              <w:bottom w:val="single" w:color="D9DEE4" w:sz="4"/>
+              <w:right w:val="single" w:color="D9DEE4" w:sz="4"/>
+            </w:tcBorders>
+            <w:tcMar>
+              <w:top w:type="dxa" w:w="80"/>
+              <w:left w:type="dxa" w:w="120"/>
+              <w:bottom w:type="dxa" w:w="80"/>
+              <w:right w:type="dxa" w:w="120"/>
+            </w:tcMar>
+            <w:vAlign w:val="center"/>
+          </w:tcPr>
+          <w:p>
+            <w:pPr>
+              <w:spacing w:after="0" w:line="260"/>
+            </w:pPr>
+            <w:r>
+              <w:rPr>
+                <w:sz w:val="20"/>
+                <w:szCs w:val="20"/>
+              </w:rPr>
+              <w:t xml:space="preserve">Página sin HTTPS, o permiso denegado</w:t>
+            </w:r>
+          </w:p>
+        </w:tc>
+        <w:tc>
+          <w:tcPr>
+            <w:tcW w:type="dxa" w:w="3120"/>
+            <w:tcBorders>
+              <w:top w:val="single" w:color="D9DEE4" w:sz="4"/>
+              <w:left w:val="single" w:color="D9DEE4" w:sz="4"/>
+              <w:bottom w:val="single" w:color="D9DEE4" w:sz="4"/>
+              <w:right w:val="single" w:color="D9DEE4" w:sz="4"/>
+            </w:tcBorders>
+            <w:tcMar>
+              <w:top w:type="dxa" w:w="80"/>
+              <w:left w:type="dxa" w:w="120"/>
+              <w:bottom w:type="dxa" w:w="80"/>
+              <w:right w:type="dxa" w:w="120"/>
+            </w:tcMar>
+            <w:vAlign w:val="center"/>
+          </w:tcPr>
+          <w:p>
+            <w:pPr>
+              <w:spacing w:after="0" w:line="260"/>
+            </w:pPr>
+            <w:r>
+              <w:rPr>
+                <w:sz w:val="20"/>
+                <w:szCs w:val="20"/>
+              </w:rPr>
+              <w:t xml:space="preserve">Sirve por HTTPS; el firmante siempre puede subir archivo.</w:t>
+            </w:r>
+          </w:p>
+        </w:tc>
+      </w:tr>
+      <w:tr>
+        <w:tc>
+          <w:tcPr>
+            <w:tcW w:type="dxa" w:w="3120"/>
+            <w:tcBorders>
+              <w:top w:val="single" w:color="D9DEE4" w:sz="4"/>
+              <w:left w:val="single" w:color="D9DEE4" w:sz="4"/>
+              <w:bottom w:val="single" w:color="D9DEE4" w:sz="4"/>
+              <w:right w:val="single" w:color="D9DEE4" w:sz="4"/>
+            </w:tcBorders>
+            <w:tcMar>
+              <w:top w:type="dxa" w:w="80"/>
+              <w:left w:type="dxa" w:w="120"/>
+              <w:bottom w:type="dxa" w:w="80"/>
+              <w:right w:type="dxa" w:w="120"/>
+            </w:tcMar>
+            <w:vAlign w:val="center"/>
+          </w:tcPr>
+          <w:p>
+            <w:pPr>
+              <w:spacing w:after="0" w:line="260"/>
+            </w:pPr>
+            <w:r>
+              <w:rPr>
+                <w:sz w:val="20"/>
+                <w:szCs w:val="20"/>
+              </w:rPr>
+              <w:t xml:space="preserve">La cámara no abre (selfie)</w:t>
+            </w:r>
+          </w:p>
+        </w:tc>
+        <w:tc>
+          <w:tcPr>
+            <w:tcW w:type="dxa" w:w="3120"/>
+            <w:tcBorders>
+              <w:top w:val="single" w:color="D9DEE4" w:sz="4"/>
+              <w:left w:val="single" w:color="D9DEE4" w:sz="4"/>
+              <w:bottom w:val="single" w:color="D9DEE4" w:sz="4"/>
+              <w:right w:val="single" w:color="D9DEE4" w:sz="4"/>
+            </w:tcBorders>
+            <w:tcMar>
+              <w:top w:type="dxa" w:w="80"/>
+              <w:left w:type="dxa" w:w="120"/>
+              <w:bottom w:type="dxa" w:w="80"/>
+              <w:right w:type="dxa" w:w="120"/>
+            </w:tcMar>
+            <w:vAlign w:val="center"/>
+          </w:tcPr>
+          <w:p>
+            <w:pPr>
+              <w:spacing w:after="0" w:line="260"/>
+            </w:pPr>
+            <w:r>
+              <w:rPr>
+                <w:sz w:val="20"/>
+                <w:szCs w:val="20"/>
+              </w:rPr>
+              <w:t xml:space="preserve">Página sin HTTPS, o permiso denegado</w:t>
+            </w:r>
+          </w:p>
+        </w:tc>
+        <w:tc>
+          <w:tcPr>
+            <w:tcW w:type="dxa" w:w="3120"/>
+            <w:tcBorders>
+              <w:top w:val="single" w:color="D9DEE4" w:sz="4"/>
+              <w:left w:val="single" w:color="D9DEE4" w:sz="4"/>
+              <w:bottom w:val="single" w:color="D9DEE4" w:sz="4"/>
+              <w:right w:val="single" w:color="D9DEE4" w:sz="4"/>
+            </w:tcBorders>
+            <w:tcMar>
+              <w:top w:type="dxa" w:w="80"/>
+              <w:left w:type="dxa" w:w="120"/>
+              <w:bottom w:type="dxa" w:w="80"/>
+              <w:right w:type="dxa" w:w="120"/>
+            </w:tcMar>
+            <w:vAlign w:val="center"/>
+          </w:tcPr>
+          <w:p>
+            <w:pPr>
+              <w:spacing w:after="0" w:line="260"/>
+            </w:pPr>
+            <w:r>
+              <w:rPr>
+                <w:sz w:val="20"/>
+                <w:szCs w:val="20"/>
+              </w:rPr>
+              <w:t xml:space="preserve">Sirve por HTTPS. </w:t>
+            </w:r>
+            <w:r>
+              <w:rPr>
+                <w:b/>
+                <w:bCs/>
+                <w:sz w:val="20"/>
+                <w:szCs w:val="20"/>
+              </w:rPr>
+              <w:t xml:space="preserve">Sin alternativa de archivo</w:t>
+            </w:r>
+            <w:r>
+              <w:rPr>
+                <w:sz w:val="20"/>
+                <w:szCs w:val="20"/>
+              </w:rPr>
+              <w:t xml:space="preserve"> (sección 9): la pantalla de error ofrece Reintentar y Regresar.</w:t>
+            </w:r>
+          </w:p>
+        </w:tc>
+      </w:tr>
+      <w:tr>
+        <w:tc>
+          <w:tcPr>
+            <w:tcW w:type="dxa" w:w="3120"/>
+            <w:tcBorders>
+              <w:top w:val="single" w:color="D9DEE4" w:sz="4"/>
+              <w:left w:val="single" w:color="D9DEE4" w:sz="4"/>
+              <w:bottom w:val="single" w:color="D9DEE4" w:sz="4"/>
+              <w:right w:val="single" w:color="D9DEE4" w:sz="4"/>
+            </w:tcBorders>
+            <w:tcMar>
+              <w:top w:type="dxa" w:w="80"/>
+              <w:left w:type="dxa" w:w="120"/>
+              <w:bottom w:type="dxa" w:w="80"/>
+              <w:right w:type="dxa" w:w="120"/>
+            </w:tcMar>
+            <w:vAlign w:val="center"/>
+          </w:tcPr>
+          <w:p>
+            <w:pPr>
+              <w:spacing w:after="0" w:line="260"/>
+            </w:pPr>
+            <w:r>
+              <w:rPr>
+                <w:sz w:val="20"/>
+                <w:szCs w:val="20"/>
+              </w:rPr>
+              <w:t xml:space="preserve">En INE no hay detección en vivo y en consola aparece "Worker de escaneo no disponible"</w:t>
+            </w:r>
+          </w:p>
+        </w:tc>
+        <w:tc>
+          <w:tcPr>
+            <w:tcW w:type="dxa" w:w="3120"/>
+            <w:tcBorders>
+              <w:top w:val="single" w:color="D9DEE4" w:sz="4"/>
+              <w:left w:val="single" w:color="D9DEE4" w:sz="4"/>
+              <w:bottom w:val="single" w:color="D9DEE4" w:sz="4"/>
+              <w:right w:val="single" w:color="D9DEE4" w:sz="4"/>
+            </w:tcBorders>
+            <w:tcMar>
+              <w:top w:type="dxa" w:w="80"/>
+              <w:left w:type="dxa" w:w="120"/>
+              <w:bottom w:type="dxa" w:w="80"/>
+              <w:right w:type="dxa" w:w="120"/>
+            </w:tcMar>
+            <w:vAlign w:val="center"/>
+          </w:tcPr>
+          <w:p>
+            <w:pPr>
+              <w:spacing w:after="0" w:line="260"/>
+            </w:pPr>
+            <w:r>
+              <w:rPr>
+                <w:rFonts w:ascii="Consolas" w:cs="Consolas" w:eastAsia="Consolas" w:hAnsi="Consolas"/>
+                <w:color w:val="111928"/>
+                <w:sz w:val="18"/>
+                <w:szCs w:val="18"/>
+                <w:shd w:fill="F4F6F8" w:val="clear"/>
+              </w:rPr>
+              <w:t xml:space="preserve">scan-assets/</w:t>
+            </w:r>
+            <w:r>
+              <w:rPr>
+                <w:sz w:val="20"/>
+                <w:szCs w:val="20"/>
+              </w:rPr>
+              <w:t xml:space="preserve"> no se está sirviendo en la URL esperada</w:t>
+            </w:r>
+          </w:p>
+        </w:tc>
+        <w:tc>
+          <w:tcPr>
+            <w:tcW w:type="dxa" w:w="3120"/>
+            <w:tcBorders>
+              <w:top w:val="single" w:color="D9DEE4" w:sz="4"/>
+              <w:left w:val="single" w:color="D9DEE4" w:sz="4"/>
+              <w:bottom w:val="single" w:color="D9DEE4" w:sz="4"/>
+              <w:right w:val="single" w:color="D9DEE4" w:sz="4"/>
+            </w:tcBorders>
+            <w:tcMar>
+              <w:top w:type="dxa" w:w="80"/>
+              <w:left w:type="dxa" w:w="120"/>
+              <w:bottom w:type="dxa" w:w="80"/>
+              <w:right w:type="dxa" w:w="120"/>
+            </w:tcMar>
+            <w:vAlign w:val="center"/>
+          </w:tcPr>
+          <w:p>
+            <w:pPr>
+              <w:spacing w:after="0" w:line="260"/>
+            </w:pPr>
+            <w:r>
+              <w:rPr>
+                <w:sz w:val="20"/>
+                <w:szCs w:val="20"/>
+              </w:rPr>
+              <w:t xml:space="preserve">Copia la carpeta (sección 4.3) y comprueba que </w:t>
+            </w:r>
+            <w:r>
+              <w:rPr>
+                <w:rFonts w:ascii="Consolas" w:cs="Consolas" w:eastAsia="Consolas" w:hAnsi="Consolas"/>
+                <w:color w:val="111928"/>
+                <w:sz w:val="18"/>
+                <w:szCs w:val="18"/>
+                <w:shd w:fill="F4F6F8" w:val="clear"/>
+              </w:rPr>
+              <w:t xml:space="preserve">/digid-scan/scan-worker.js</w:t>
+            </w:r>
+            <w:r>
+              <w:rPr>
+                <w:sz w:val="20"/>
+                <w:szCs w:val="20"/>
+              </w:rPr>
+              <w:t xml:space="preserve"> responde 200. Si usas otra ruta, indícala en </w:t>
+            </w:r>
+            <w:r>
+              <w:rPr>
+                <w:rFonts w:ascii="Consolas" w:cs="Consolas" w:eastAsia="Consolas" w:hAnsi="Consolas"/>
+                <w:color w:val="111928"/>
+                <w:sz w:val="18"/>
+                <w:szCs w:val="18"/>
+                <w:shd w:fill="F4F6F8" w:val="clear"/>
+              </w:rPr>
+              <w:t xml:space="preserve">scanAssets.workerUrl</w:t>
+            </w:r>
+            <w:r>
+              <w:rPr>
+                <w:sz w:val="20"/>
+                <w:szCs w:val="20"/>
+              </w:rPr>
+              <w:t xml:space="preserve">.</w:t>
+            </w:r>
+          </w:p>
+        </w:tc>
+      </w:tr>
+      <w:tr>
+        <w:tc>
+          <w:tcPr>
+            <w:tcW w:type="dxa" w:w="3120"/>
+            <w:tcBorders>
+              <w:top w:val="single" w:color="D9DEE4" w:sz="4"/>
+              <w:left w:val="single" w:color="D9DEE4" w:sz="4"/>
+              <w:bottom w:val="single" w:color="D9DEE4" w:sz="4"/>
+              <w:right w:val="single" w:color="D9DEE4" w:sz="4"/>
+            </w:tcBorders>
+            <w:tcMar>
+              <w:top w:type="dxa" w:w="80"/>
+              <w:left w:type="dxa" w:w="120"/>
+              <w:bottom w:type="dxa" w:w="80"/>
+              <w:right w:type="dxa" w:w="120"/>
+            </w:tcMar>
+            <w:vAlign w:val="center"/>
+          </w:tcPr>
+          <w:p>
+            <w:pPr>
+              <w:spacing w:after="0" w:line="260"/>
+            </w:pPr>
+            <w:r>
+              <w:rPr>
+                <w:sz w:val="20"/>
+                <w:szCs w:val="20"/>
+              </w:rPr>
+              <w:t xml:space="preserve">Funcionaba en local y tras desplegar dejó de funcionar el escáner</w:t>
+            </w:r>
+          </w:p>
+        </w:tc>
+        <w:tc>
+          <w:tcPr>
+            <w:tcW w:type="dxa" w:w="3120"/>
+            <w:tcBorders>
+              <w:top w:val="single" w:color="D9DEE4" w:sz="4"/>
+              <w:left w:val="single" w:color="D9DEE4" w:sz="4"/>
+              <w:bottom w:val="single" w:color="D9DEE4" w:sz="4"/>
+              <w:right w:val="single" w:color="D9DEE4" w:sz="4"/>
+            </w:tcBorders>
+            <w:tcMar>
+              <w:top w:type="dxa" w:w="80"/>
+              <w:left w:type="dxa" w:w="120"/>
+              <w:bottom w:type="dxa" w:w="80"/>
+              <w:right w:type="dxa" w:w="120"/>
+            </w:tcMar>
+            <w:vAlign w:val="center"/>
+          </w:tcPr>
+          <w:p>
+            <w:pPr>
+              <w:spacing w:after="0" w:line="260"/>
+            </w:pPr>
+            <w:r>
+              <w:rPr>
+                <w:rFonts w:ascii="Consolas" w:cs="Consolas" w:eastAsia="Consolas" w:hAnsi="Consolas"/>
+                <w:color w:val="111928"/>
+                <w:sz w:val="18"/>
+                <w:szCs w:val="18"/>
+                <w:shd w:fill="F4F6F8" w:val="clear"/>
+              </w:rPr>
+              <w:t xml:space="preserve">npm ci</w:t>
+            </w:r>
+            <w:r>
+              <w:rPr>
+                <w:sz w:val="20"/>
+                <w:szCs w:val="20"/>
+              </w:rPr>
+              <w:t xml:space="preserve"> borró </w:t>
+            </w:r>
+            <w:r>
+              <w:rPr>
+                <w:rFonts w:ascii="Consolas" w:cs="Consolas" w:eastAsia="Consolas" w:hAnsi="Consolas"/>
+                <w:color w:val="111928"/>
+                <w:sz w:val="18"/>
+                <w:szCs w:val="18"/>
+                <w:shd w:fill="F4F6F8" w:val="clear"/>
+              </w:rPr>
+              <w:t xml:space="preserve">node_modules</w:t>
+            </w:r>
+            <w:r>
+              <w:rPr>
+                <w:sz w:val="20"/>
+                <w:szCs w:val="20"/>
+              </w:rPr>
+              <w:t xml:space="preserve"> y con él la copia manual de </w:t>
+            </w:r>
+            <w:r>
+              <w:rPr>
+                <w:rFonts w:ascii="Consolas" w:cs="Consolas" w:eastAsia="Consolas" w:hAnsi="Consolas"/>
+                <w:color w:val="111928"/>
+                <w:sz w:val="18"/>
+                <w:szCs w:val="18"/>
+                <w:shd w:fill="F4F6F8" w:val="clear"/>
+              </w:rPr>
+              <w:t xml:space="preserve">scan-assets/</w:t>
+            </w:r>
+          </w:p>
+        </w:tc>
+        <w:tc>
+          <w:tcPr>
+            <w:tcW w:type="dxa" w:w="3120"/>
+            <w:tcBorders>
+              <w:top w:val="single" w:color="D9DEE4" w:sz="4"/>
+              <w:left w:val="single" w:color="D9DEE4" w:sz="4"/>
+              <w:bottom w:val="single" w:color="D9DEE4" w:sz="4"/>
+              <w:right w:val="single" w:color="D9DEE4" w:sz="4"/>
+            </w:tcBorders>
+            <w:tcMar>
+              <w:top w:type="dxa" w:w="80"/>
+              <w:left w:type="dxa" w:w="120"/>
+              <w:bottom w:type="dxa" w:w="80"/>
+              <w:right w:type="dxa" w:w="120"/>
+            </w:tcMar>
+            <w:vAlign w:val="center"/>
+          </w:tcPr>
+          <w:p>
+            <w:pPr>
+              <w:spacing w:after="0" w:line="260"/>
+            </w:pPr>
+            <w:r>
+              <w:rPr>
+                <w:sz w:val="20"/>
+                <w:szCs w:val="20"/>
+              </w:rPr>
+              <w:t xml:space="preserve">Engancha la copia al </w:t>
+            </w:r>
+            <w:r>
+              <w:rPr>
+                <w:rFonts w:ascii="Consolas" w:cs="Consolas" w:eastAsia="Consolas" w:hAnsi="Consolas"/>
+                <w:color w:val="111928"/>
+                <w:sz w:val="18"/>
+                <w:szCs w:val="18"/>
+                <w:shd w:fill="F4F6F8" w:val="clear"/>
+              </w:rPr>
+              <w:t xml:space="preserve">postinstall</w:t>
+            </w:r>
+            <w:r>
+              <w:rPr>
+                <w:sz w:val="20"/>
+                <w:szCs w:val="20"/>
+              </w:rPr>
+              <w:t xml:space="preserve"> (sección 4.3).</w:t>
+            </w:r>
+          </w:p>
+        </w:tc>
+      </w:tr>
+      <w:tr>
+        <w:tc>
+          <w:tcPr>
+            <w:tcW w:type="dxa" w:w="3120"/>
+            <w:tcBorders>
+              <w:top w:val="single" w:color="D9DEE4" w:sz="4"/>
+              <w:left w:val="single" w:color="D9DEE4" w:sz="4"/>
+              <w:bottom w:val="single" w:color="D9DEE4" w:sz="4"/>
+              <w:right w:val="single" w:color="D9DEE4" w:sz="4"/>
+            </w:tcBorders>
+            <w:tcMar>
+              <w:top w:type="dxa" w:w="80"/>
+              <w:left w:type="dxa" w:w="120"/>
+              <w:bottom w:type="dxa" w:w="80"/>
+              <w:right w:type="dxa" w:w="120"/>
+            </w:tcMar>
+            <w:vAlign w:val="center"/>
+          </w:tcPr>
+          <w:p>
+            <w:pPr>
+              <w:spacing w:after="0" w:line="260"/>
+            </w:pPr>
+            <w:r>
+              <w:rPr>
+                <w:sz w:val="20"/>
+                <w:szCs w:val="20"/>
+              </w:rPr>
+              <w:t xml:space="preserve">La selfie sí captura sola pero la INE no</w:t>
+            </w:r>
+          </w:p>
+        </w:tc>
+        <w:tc>
+          <w:tcPr>
+            <w:tcW w:type="dxa" w:w="3120"/>
+            <w:tcBorders>
+              <w:top w:val="single" w:color="D9DEE4" w:sz="4"/>
+              <w:left w:val="single" w:color="D9DEE4" w:sz="4"/>
+              <w:bottom w:val="single" w:color="D9DEE4" w:sz="4"/>
+              <w:right w:val="single" w:color="D9DEE4" w:sz="4"/>
+            </w:tcBorders>
+            <w:tcMar>
+              <w:top w:type="dxa" w:w="80"/>
+              <w:left w:type="dxa" w:w="120"/>
+              <w:bottom w:type="dxa" w:w="80"/>
+              <w:right w:type="dxa" w:w="120"/>
+            </w:tcMar>
+            <w:vAlign w:val="center"/>
+          </w:tcPr>
+          <w:p>
+            <w:pPr>
+              <w:spacing w:after="0" w:line="260"/>
+            </w:pPr>
+            <w:r>
+              <w:rPr>
+                <w:sz w:val="20"/>
+                <w:szCs w:val="20"/>
+              </w:rPr>
+              <w:t xml:space="preserve">Son dos mecanismos distintos: selfie usa MediaPipe (CDN); INE, el worker local de OpenCV</w:t>
+            </w:r>
+          </w:p>
+        </w:tc>
+        <w:tc>
+          <w:tcPr>
+            <w:tcW w:type="dxa" w:w="3120"/>
+            <w:tcBorders>
+              <w:top w:val="single" w:color="D9DEE4" w:sz="4"/>
+              <w:left w:val="single" w:color="D9DEE4" w:sz="4"/>
+              <w:bottom w:val="single" w:color="D9DEE4" w:sz="4"/>
+              <w:right w:val="single" w:color="D9DEE4" w:sz="4"/>
+            </w:tcBorders>
+            <w:tcMar>
+              <w:top w:type="dxa" w:w="80"/>
+              <w:left w:type="dxa" w:w="120"/>
+              <w:bottom w:type="dxa" w:w="80"/>
+              <w:right w:type="dxa" w:w="120"/>
+            </w:tcMar>
+            <w:vAlign w:val="center"/>
+          </w:tcPr>
+          <w:p>
+            <w:pPr>
+              <w:spacing w:after="0" w:line="260"/>
+            </w:pPr>
+            <w:r>
+              <w:rPr>
+                <w:sz w:val="20"/>
+                <w:szCs w:val="20"/>
+              </w:rPr>
+              <w:t xml:space="preserve">El síntoma apunta a </w:t>
+            </w:r>
+            <w:r>
+              <w:rPr>
+                <w:rFonts w:ascii="Consolas" w:cs="Consolas" w:eastAsia="Consolas" w:hAnsi="Consolas"/>
+                <w:color w:val="111928"/>
+                <w:sz w:val="18"/>
+                <w:szCs w:val="18"/>
+                <w:shd w:fill="F4F6F8" w:val="clear"/>
+              </w:rPr>
+              <w:t xml:space="preserve">scan-assets/</w:t>
+            </w:r>
+            <w:r>
+              <w:rPr>
+                <w:sz w:val="20"/>
+                <w:szCs w:val="20"/>
+              </w:rPr>
+              <w:t xml:space="preserve">, no a </w:t>
+            </w:r>
+            <w:r>
+              <w:rPr>
+                <w:rFonts w:ascii="Consolas" w:cs="Consolas" w:eastAsia="Consolas" w:hAnsi="Consolas"/>
+                <w:color w:val="111928"/>
+                <w:sz w:val="18"/>
+                <w:szCs w:val="18"/>
+                <w:shd w:fill="F4F6F8" w:val="clear"/>
+              </w:rPr>
+              <w:t xml:space="preserve">detectionAssets</w:t>
+            </w:r>
+            <w:r>
+              <w:rPr>
+                <w:sz w:val="20"/>
+                <w:szCs w:val="20"/>
+              </w:rPr>
+              <w:t xml:space="preserve">.</w:t>
             </w:r>
           </w:p>
         </w:tc>
@@ -10096,7 +11575,33 @@
         <w:t xml:space="preserve">tokenTransport="header"</w:t>
       </w:r>
       <w:r>
-        <w:t xml:space="preserve"> activado una vez que Digid confirme el soporte en tu ambiente (sección 5.1).</w:t>
+        <w:t xml:space="preserve"> activado una vez que el backend acepta </w:t>
+      </w:r>
+      <w:r>
+        <w:rPr>
+          <w:rFonts w:ascii="Consolas" w:cs="Consolas" w:eastAsia="Consolas" w:hAnsi="Consolas"/>
+          <w:color w:val="111928"/>
+          <w:sz w:val="20"/>
+          <w:szCs w:val="20"/>
+          <w:shd w:fill="F4F6F8" w:val="clear"/>
+        </w:rPr>
+        <w:t xml:space="preserve">X-Digid-Token</w:t>
+      </w:r>
+      <w:r>
+        <w:t xml:space="preserve"> (sección 5.1); con el default </w:t>
+      </w:r>
+      <w:r>
+        <w:rPr>
+          <w:rFonts w:ascii="Consolas" w:cs="Consolas" w:eastAsia="Consolas" w:hAnsi="Consolas"/>
+          <w:color w:val="111928"/>
+          <w:sz w:val="20"/>
+          <w:szCs w:val="20"/>
+          <w:shd w:fill="F4F6F8" w:val="clear"/>
+        </w:rPr>
+        <w:t xml:space="preserve">'both'</w:t>
+      </w:r>
+      <w:r>
+        <w:t xml:space="preserve"> el token sigue llegando también por query a los logs de acceso.</w:t>
       </w:r>
     </w:p>
     <w:p>
@@ -10114,7 +11619,7 @@
       <w:r>
         <w:t xml:space="preserve">Dudas de integración y alta de dominios CORS: </w:t>
       </w:r>
-      <w:hyperlink w:history="1" r:id="rIdsh18yqwvch6xol_wl2njd">
+      <w:hyperlink w:history="1" r:id="rIdj1es11aljsu0en2cxnzqf">
         <w:r>
           <w:rPr>
             <w:rStyle w:val="Hyperlink"/>
@@ -10130,7 +11635,7 @@
       <w:r>
         <w:t xml:space="preserve">Reporte de problemas del SDK: </w:t>
       </w:r>
-      <w:hyperlink w:history="1" r:id="rIdp4kj5wfbyahb9p5a39alb">
+      <w:hyperlink w:history="1" r:id="rId4tqjynaixeqpjddj1gpew">
         <w:r>
           <w:rPr>
             <w:rStyle w:val="Hyperlink"/>
@@ -10154,7 +11659,7 @@
           <w:sz w:val="18"/>
           <w:szCs w:val="18"/>
         </w:rPr>
-        <w:t xml:space="preserve">Digid — plataforma de firma digital. Esta guía corresponde a la versión 1.1.0 del SDK.</w:t>
+        <w:t xml:space="preserve">Digid — plataforma de firma digital. Esta guía corresponde a la versión 1.3.0 del SDK.</w:t>
       </w:r>
     </w:p>
     <w:sectPr>
@@ -10226,7 +11731,7 @@
         <w:sz w:val="16"/>
         <w:szCs w:val="16"/>
       </w:rPr>
-      <w:t xml:space="preserve">Digid · SDK de Firma Autógrafa v1.1.0   </w:t>
+      <w:t xml:space="preserve">Digid · SDK de Firma Autógrafa v1.3.0   </w:t>
     </w:r>
     <w:r>
       <w:rPr>

</xml_diff>

<commit_message>
docs: checklist de producción coherente con la política CORS actual
</commit_message>
<xml_diff>
--- a/docs/GUIA-INTEGRACION-CLIENTES.docx
+++ b/docs/GUIA-INTEGRACION-CLIENTES.docx
@@ -11330,7 +11330,33 @@
         <w:spacing w:after="120" w:line="276"/>
       </w:pPr>
       <w:r>
-        <w:t xml:space="preserve">Dominio(s) de producción dados de alta en el CORS de Digid.</w:t>
+        <w:t xml:space="preserve">Backend de Digid del ambiente destino con los endpoints </w:t>
+      </w:r>
+      <w:r>
+        <w:rPr>
+          <w:rFonts w:ascii="Consolas" w:cs="Consolas" w:eastAsia="Consolas" w:hAnsi="Consolas"/>
+          <w:color w:val="111928"/>
+          <w:sz w:val="20"/>
+          <w:szCs w:val="20"/>
+          <w:shd w:fill="F4F6F8" w:val="clear"/>
+        </w:rPr>
+        <w:t xml:space="preserve">document_pdf</w:t>
+      </w:r>
+      <w:r>
+        <w:t xml:space="preserve">/</w:t>
+      </w:r>
+      <w:r>
+        <w:rPr>
+          <w:rFonts w:ascii="Consolas" w:cs="Consolas" w:eastAsia="Consolas" w:hAnsi="Consolas"/>
+          <w:color w:val="111928"/>
+          <w:sz w:val="20"/>
+          <w:szCs w:val="20"/>
+          <w:shd w:fill="F4F6F8" w:val="clear"/>
+        </w:rPr>
+        <w:t xml:space="preserve">signature_image</w:t>
+      </w:r>
+      <w:r>
+        <w:t xml:space="preserve"> (hoy no se requiere alta de dominio en CORS).</w:t>
       </w:r>
     </w:p>
     <w:p>
@@ -11619,7 +11645,7 @@
       <w:r>
         <w:t xml:space="preserve">Dudas de integración y alta de dominios CORS: </w:t>
       </w:r>
-      <w:hyperlink w:history="1" r:id="rIdj1es11aljsu0en2cxnzqf">
+      <w:hyperlink w:history="1" r:id="rIdwg6owc7bdhjnkh_x3hfq4">
         <w:r>
           <w:rPr>
             <w:rStyle w:val="Hyperlink"/>
@@ -11635,7 +11661,7 @@
       <w:r>
         <w:t xml:space="preserve">Reporte de problemas del SDK: </w:t>
       </w:r>
-      <w:hyperlink w:history="1" r:id="rId4tqjynaixeqpjddj1gpew">
+      <w:hyperlink w:history="1" r:id="rIdgawr6-h2vbdf4p7w9h-rm">
         <w:r>
           <w:rPr>
             <w:rStyle w:val="Hyperlink"/>

</xml_diff>